<commit_message>
Assemble full SNSF CV draft document (header + four narrative modules + output list)
Co-Authored-By: Claude Fable 5 <noreply@anthropic.com>
Claude-Session: https://claude.ai/code/session_01Pijyy83JyS8bJxoVQgxwZB
</commit_message>
<xml_diff>
--- a/04-other-documents/cv-snsf-draft.docx
+++ b/04-other-documents/cv-snsf-draft.docx
@@ -2,21 +2,51 @@
 <file path=word/document.xml><?xml version="1.0" encoding="utf-8"?>
 <w:document xmlns:w="http://schemas.openxmlformats.org/wordprocessingml/2006/main" xmlns:m="http://schemas.openxmlformats.org/officeDocument/2006/math" xmlns:r="http://schemas.openxmlformats.org/officeDocument/2006/relationships" xmlns:o="urn:schemas-microsoft-com:office:office" xmlns:v="urn:schemas-microsoft-com:vml" xmlns:w10="urn:schemas-microsoft-com:office:word" xmlns:a="http://schemas.openxmlformats.org/drawingml/2006/main" xmlns:pic="http://schemas.openxmlformats.org/drawingml/2006/picture" xmlns:wp="http://schemas.openxmlformats.org/drawingml/2006/wordprocessingDrawing">
   <w:body>
-    <w:bookmarkStart w:id="26" w:name="Xa8406471446f014a74a859a1f62a31a58377ea4"/>
-    <w:p>
-      <w:pPr>
-        <w:pStyle w:val="Heading1"/>
-      </w:pPr>
-      <w:r>
-        <w:t xml:space="preserve">CV in SNSF format: draft for the RGO form (upload 2) and the portal</w:t>
-      </w:r>
-    </w:p>
-    <w:p>
-      <w:pPr>
-        <w:pStyle w:val="BlockText"/>
-      </w:pPr>
-      <w:r>
-        <w:t xml:space="preserve">Assembled from</w:t>
+    <w:p>
+      <w:pPr>
+        <w:pStyle w:val="FirstParagraph"/>
+      </w:pPr>
+      <w:r>
+        <w:rPr>
+          <w:bCs/>
+          <w:b/>
+        </w:rPr>
+        <w:t xml:space="preserve">Curriculum Vitae - Erol Orel</w:t>
+      </w:r>
+      <w:r>
+        <w:t xml:space="preserve"> </w:t>
+      </w:r>
+      <w:r>
+        <w:t xml:space="preserve">(SNSF format; content to transfer to the portal)</w:t>
+      </w:r>
+    </w:p>
+    <w:bookmarkStart w:id="20" w:name="personal-data"/>
+    <w:p>
+      <w:pPr>
+        <w:pStyle w:val="Heading2"/>
+      </w:pPr>
+      <w:r>
+        <w:t xml:space="preserve">Personal data</w:t>
+      </w:r>
+    </w:p>
+    <w:p>
+      <w:pPr>
+        <w:pStyle w:val="FirstParagraph"/>
+      </w:pPr>
+      <w:r>
+        <w:t xml:space="preserve">Erol Orel, PhD, FRM · Senior Research Associate, Institute of Global Health, Faculty of</w:t>
+      </w:r>
+      <w:r>
+        <w:t xml:space="preserve"> </w:t>
+      </w:r>
+      <w:r>
+        <w:t xml:space="preserve">Medicine, University of Geneva · Erol.Orel@unige.ch · +41 79 795 83 19 ·</w:t>
+      </w:r>
+      <w:r>
+        <w:t xml:space="preserve"> </w:t>
+      </w:r>
+      <w:r>
+        <w:t xml:space="preserve">ORCID</w:t>
       </w:r>
       <w:r>
         <w:t xml:space="preserve"> </w:t>
@@ -25,120 +55,11 @@
         <w:rPr>
           <w:rStyle w:val="VerbatimChar"/>
         </w:rPr>
-        <w:t xml:space="preserve">cv-orel-current.pdf</w:t>
-      </w:r>
-      <w:r>
-        <w:t xml:space="preserve"> </w:t>
-      </w:r>
-      <w:r>
-        <w:t xml:space="preserve">(facts) and</w:t>
-      </w:r>
-      <w:r>
-        <w:t xml:space="preserve"> </w:t>
-      </w:r>
-      <w:r>
-        <w:rPr>
-          <w:rStyle w:val="VerbatimChar"/>
-        </w:rPr>
-        <w:t xml:space="preserve">cv-narratives/</w:t>
-      </w:r>
-      <w:r>
-        <w:t xml:space="preserve"> </w:t>
-      </w:r>
-      <w:r>
-        <w:t xml:space="preserve">(the four SciCV modules).</w:t>
-      </w:r>
-      <w:r>
-        <w:t xml:space="preserve"> </w:t>
-      </w:r>
-      <w:r>
-        <w:t xml:space="preserve">The SNSF CV is completed on the portal (portal.snf.ch) and exported as PDF; this draft is</w:t>
-      </w:r>
-      <w:r>
-        <w:t xml:space="preserve"> </w:t>
-      </w:r>
-      <w:r>
-        <w:t xml:space="preserve">the content to paste, section by section.</w:t>
-      </w:r>
-      <w:r>
-        <w:t xml:space="preserve"> </w:t>
-      </w:r>
-      <w:r>
-        <w:rPr>
-          <w:rStyle w:val="VerbatimChar"/>
-        </w:rPr>
-        <w:t xml:space="preserve">[[Verify the 2026 portal's exact section names and word limits when you open it; the narrative allocation follows cv-narratives/README.]]</w:t>
-      </w:r>
-      <w:r>
-        <w:t xml:space="preserve"> </w:t>
-      </w:r>
-      <w:r>
-        <w:t xml:space="preserve">The .docx next to this file concatenates this header with the four modules and the output</w:t>
-      </w:r>
-      <w:r>
-        <w:t xml:space="preserve"> </w:t>
-      </w:r>
-      <w:r>
-        <w:t xml:space="preserve">list: one document to upload to the Formulaire RGO by Thursday 15 October.</w:t>
-      </w:r>
-    </w:p>
-    <w:bookmarkStart w:id="21" w:name="personal-data"/>
-    <w:p>
-      <w:pPr>
-        <w:pStyle w:val="Heading2"/>
-      </w:pPr>
-      <w:r>
-        <w:t xml:space="preserve">Personal data</w:t>
-      </w:r>
-    </w:p>
-    <w:p>
-      <w:pPr>
-        <w:pStyle w:val="FirstParagraph"/>
-      </w:pPr>
-      <w:r>
-        <w:t xml:space="preserve">Erol Orel, PhD, FRM · Senior Research Associate, Institute of Global Health, Faculty of</w:t>
-      </w:r>
-      <w:r>
-        <w:t xml:space="preserve"> </w:t>
-      </w:r>
-      <w:r>
-        <w:t xml:space="preserve">Medicine, University of Geneva ·</w:t>
-      </w:r>
-      <w:r>
-        <w:t xml:space="preserve"> </w:t>
-      </w:r>
-      <w:hyperlink r:id="rId20">
-        <w:r>
-          <w:rPr>
-            <w:rStyle w:val="Hyperlink"/>
-          </w:rPr>
-          <w:t xml:space="preserve">Erol.Orel@unige.ch</w:t>
-        </w:r>
-      </w:hyperlink>
-      <w:r>
-        <w:t xml:space="preserve"> </w:t>
-      </w:r>
-      <w:r>
-        <w:t xml:space="preserve">· +41 79 795 83 19 ·</w:t>
-      </w:r>
-      <w:r>
-        <w:t xml:space="preserve"> </w:t>
-      </w:r>
-      <w:r>
-        <w:t xml:space="preserve">ORCID</w:t>
-      </w:r>
-      <w:r>
-        <w:t xml:space="preserve"> </w:t>
-      </w:r>
-      <w:r>
-        <w:rPr>
-          <w:rStyle w:val="VerbatimChar"/>
-        </w:rPr>
         <w:t xml:space="preserve">[[check/refresh the public ORCID record this week]]</w:t>
       </w:r>
     </w:p>
-    <w:bookmarkEnd w:id="21"/>
-    <w:bookmarkStart w:id="22" w:name="education"/>
+    <w:bookmarkEnd w:id="20"/>
+    <w:bookmarkStart w:id="21" w:name="education"/>
     <w:p>
       <w:pPr>
         <w:pStyle w:val="Heading2"/>
@@ -150,7 +71,7 @@
     <w:tbl>
       <w:tblPr>
         <w:tblStyle w:val="Table"/>
-        <w:tblW w:type="auto" w:w="0"/>
+        <w:tblW w:type="pct" w:w="5000"/>
         <w:tblLook w:firstRow="1" w:lastRow="0" w:firstColumn="0" w:lastColumn="0" w:noHBand="0" w:noVBand="0" w:val="0020"/>
         <w:jc w:val="start"/>
       </w:tblPr>
@@ -208,7 +129,19 @@
               <w:jc w:val="left"/>
             </w:pPr>
             <w:r>
-              <w:t xml:space="preserve">PhD in Biomedical Sciences, Global Health track, Faculty of Medicine, University of Geneva. Defended 18 December 2023. Dissertation: "Enhancing HIV Prediction through Machine Learning and Streamlining Research with LiteRev"</w:t>
+              <w:t xml:space="preserve">PhD in Biomedical Sciences, Global Health track, Faculty of Medicine, University of Geneva. Defended 18 December 2023. Dissertation:</w:t>
+            </w:r>
+            <w:r>
+              <w:t xml:space="preserve"> </w:t>
+            </w:r>
+            <w:r>
+              <w:t xml:space="preserve">“</w:t>
+            </w:r>
+            <w:r>
+              <w:t xml:space="preserve">Enhancing HIV Prediction through Machine Learning and Streamlining Research with LiteRev</w:t>
+            </w:r>
+            <w:r>
+              <w:t xml:space="preserve">”</w:t>
             </w:r>
           </w:p>
         </w:tc>
@@ -286,7 +219,25 @@
               <w:jc w:val="left"/>
             </w:pPr>
             <w:r>
-              <w:t xml:space="preserve">Master of Advanced Studies (DEA) in Econometrics, University of Geneva. Dissertation: "Additive Models and Local Kernel M-Estimator: Bandwidth Selection and Application to the Implied Volatility Surface" (supervised by Prof. Eva Cantoni)</w:t>
+              <w:t xml:space="preserve">Master of Advanced Studies (DEA) in Econometrics, University of Geneva. Dissertation:</w:t>
+            </w:r>
+            <w:r>
+              <w:t xml:space="preserve"> </w:t>
+            </w:r>
+            <w:r>
+              <w:t xml:space="preserve">“</w:t>
+            </w:r>
+            <w:r>
+              <w:t xml:space="preserve">Additive Models and Local Kernel M-Estimator: Bandwidth Selection and Application to the Implied Volatility Surface</w:t>
+            </w:r>
+            <w:r>
+              <w:t xml:space="preserve">”</w:t>
+            </w:r>
+            <w:r>
+              <w:t xml:space="preserve"> </w:t>
+            </w:r>
+            <w:r>
+              <w:t xml:space="preserve">(supervised by Prof. Eva Cantoni)</w:t>
             </w:r>
           </w:p>
         </w:tc>
@@ -318,8 +269,8 @@
         </w:tc>
       </w:tr>
     </w:tbl>
-    <w:bookmarkEnd w:id="22"/>
-    <w:bookmarkStart w:id="23" w:name="positions-held"/>
+    <w:bookmarkEnd w:id="21"/>
+    <w:bookmarkStart w:id="22" w:name="positions-held"/>
     <w:p>
       <w:pPr>
         <w:pStyle w:val="Heading2"/>
@@ -331,7 +282,7 @@
     <w:tbl>
       <w:tblPr>
         <w:tblStyle w:val="Table"/>
-        <w:tblW w:type="auto" w:w="0"/>
+        <w:tblW w:type="pct" w:w="5000"/>
         <w:tblLook w:firstRow="1" w:lastRow="0" w:firstColumn="0" w:lastColumn="0" w:noHBand="0" w:noVBand="0" w:val="0020"/>
         <w:jc w:val="start"/>
       </w:tblPr>
@@ -516,206 +467,32 @@
         <w:t xml:space="preserve">[[none to declare, or state them; the SNSF assesses output relative to academic age - PhD December 2023, so about three years]]</w:t>
       </w:r>
     </w:p>
+    <w:bookmarkEnd w:id="22"/>
+    <w:bookmarkStart w:id="23" w:name="languages"/>
+    <w:p>
+      <w:pPr>
+        <w:pStyle w:val="Heading2"/>
+      </w:pPr>
+      <w:r>
+        <w:t xml:space="preserve">Languages</w:t>
+      </w:r>
+    </w:p>
+    <w:p>
+      <w:pPr>
+        <w:pStyle w:val="FirstParagraph"/>
+      </w:pPr>
+      <w:r>
+        <w:t xml:space="preserve">French (mother tongue), English (fluent), Turkish (father tongue), German and Spanish (basic).</w:t>
+      </w:r>
+    </w:p>
     <w:bookmarkEnd w:id="23"/>
-    <w:bookmarkStart w:id="24" w:name="languages"/>
+    <w:bookmarkStart w:id="24" w:name="X42081ee612172b9b390e30b1acc715b33e1fdff"/>
     <w:p>
       <w:pPr>
         <w:pStyle w:val="Heading2"/>
       </w:pPr>
       <w:r>
-        <w:t xml:space="preserve">Languages</w:t>
-      </w:r>
-    </w:p>
-    <w:p>
-      <w:pPr>
-        <w:pStyle w:val="FirstParagraph"/>
-      </w:pPr>
-      <w:r>
-        <w:t xml:space="preserve">French (mother tongue), English (fluent), Turkish (father tongue), German and Spanish (basic).</w:t>
-      </w:r>
-    </w:p>
-    <w:bookmarkEnd w:id="24"/>
-    <w:bookmarkStart w:id="25" w:name="X312d1cbbd0f726d8a564803d6fa7fd37aced747"/>
-    <w:p>
-      <w:pPr>
-        <w:pStyle w:val="Heading2"/>
-      </w:pPr>
-      <w:r>
-        <w:t xml:space="preserve">The four narrative modules and the ten outputs</w:t>
-      </w:r>
-    </w:p>
-    <w:p>
-      <w:pPr>
-        <w:pStyle w:val="FirstParagraph"/>
-      </w:pPr>
-      <w:r>
-        <w:t xml:space="preserve">The module texts are drafted in</w:t>
-      </w:r>
-      <w:r>
-        <w:t xml:space="preserve"> </w:t>
-      </w:r>
-      <w:r>
-        <w:rPr>
-          <w:rStyle w:val="VerbatimChar"/>
-        </w:rPr>
-        <w:t xml:space="preserve">cv-narratives/module-1-knowledge.md</w:t>
-      </w:r>
-      <w:r>
-        <w:t xml:space="preserve"> </w:t>
-      </w:r>
-      <w:r>
-        <w:t xml:space="preserve">(4 outputs),</w:t>
-      </w:r>
-      <w:r>
-        <w:t xml:space="preserve"> </w:t>
-      </w:r>
-      <w:r>
-        <w:rPr>
-          <w:rStyle w:val="VerbatimChar"/>
-        </w:rPr>
-        <w:t xml:space="preserve">module-2-individuals.md</w:t>
-      </w:r>
-      <w:r>
-        <w:t xml:space="preserve"> </w:t>
-      </w:r>
-      <w:r>
-        <w:t xml:space="preserve">(2),</w:t>
-      </w:r>
-      <w:r>
-        <w:t xml:space="preserve"> </w:t>
-      </w:r>
-      <w:r>
-        <w:rPr>
-          <w:rStyle w:val="VerbatimChar"/>
-        </w:rPr>
-        <w:t xml:space="preserve">module-3-community.md</w:t>
-      </w:r>
-      <w:r>
-        <w:t xml:space="preserve"> </w:t>
-      </w:r>
-      <w:r>
-        <w:t xml:space="preserve">(2),</w:t>
-      </w:r>
-      <w:r>
-        <w:t xml:space="preserve"> </w:t>
-      </w:r>
-      <w:r>
-        <w:rPr>
-          <w:rStyle w:val="VerbatimChar"/>
-        </w:rPr>
-        <w:t xml:space="preserve">module-4-society.md</w:t>
-      </w:r>
-      <w:r>
-        <w:t xml:space="preserve"> </w:t>
-      </w:r>
-      <w:r>
-        <w:t xml:space="preserve">(2);</w:t>
-      </w:r>
-      <w:r>
-        <w:t xml:space="preserve"> </w:t>
-      </w:r>
-      <w:r>
-        <w:t xml:space="preserve">the output list with contribution statements is</w:t>
-      </w:r>
-      <w:r>
-        <w:t xml:space="preserve"> </w:t>
-      </w:r>
-      <w:r>
-        <w:rPr>
-          <w:rStyle w:val="VerbatimChar"/>
-        </w:rPr>
-        <w:t xml:space="preserve">cv-narratives/research-output-list.md</w:t>
-      </w:r>
-      <w:r>
-        <w:t xml:space="preserve">.</w:t>
-      </w:r>
-      <w:r>
-        <w:t xml:space="preserve"> </w:t>
-      </w:r>
-      <w:r>
-        <w:t xml:space="preserve">They follow in the .docx. Before upload: answer the README's open question (any real</w:t>
-      </w:r>
-      <w:r>
-        <w:t xml:space="preserve"> </w:t>
-      </w:r>
-      <w:r>
-        <w:t xml:space="preserve">co-supervision to name in Module 2?), and check Ng'ambi reads</w:t>
-      </w:r>
-      <w:r>
-        <w:t xml:space="preserve"> </w:t>
-      </w:r>
-      <w:r>
-        <w:rPr>
-          <w:bCs/>
-          <w:b/>
-        </w:rPr>
-        <w:t xml:space="preserve">accepted</w:t>
-      </w:r>
-      <w:r>
-        <w:t xml:space="preserve"> </w:t>
-      </w:r>
-      <w:r>
-        <w:t xml:space="preserve">and the BMJ Open</w:t>
-      </w:r>
-      <w:r>
-        <w:t xml:space="preserve"> </w:t>
-      </w:r>
-      <w:r>
-        <w:t xml:space="preserve">paper</w:t>
-      </w:r>
-      <w:r>
-        <w:t xml:space="preserve"> </w:t>
-      </w:r>
-      <w:r>
-        <w:rPr>
-          <w:bCs/>
-          <w:b/>
-        </w:rPr>
-        <w:t xml:space="preserve">under review</w:t>
-      </w:r>
-      <w:r>
-        <w:t xml:space="preserve">.</w:t>
-      </w:r>
-    </w:p>
-    <w:bookmarkEnd w:id="25"/>
-    <w:bookmarkEnd w:id="26"/>
-    <w:bookmarkStart w:id="27" w:name="Xf63ed11c7c804818f56278a0fb29f5741a28837"/>
-    <w:p>
-      <w:pPr>
-        <w:pStyle w:val="Heading1"/>
-      </w:pPr>
-      <w:r>
-        <w:t xml:space="preserve">Module 1: Contributions to the generation of new ideas, tools, methodologies or knowledge</w:t>
-      </w:r>
-    </w:p>
-    <w:p>
-      <w:pPr>
-        <w:pStyle w:val="BlockText"/>
-      </w:pPr>
-      <w:r>
-        <w:t xml:space="preserve">Outputs cited here:</w:t>
-      </w:r>
-      <w:r>
-        <w:t xml:space="preserve"> </w:t>
-      </w:r>
-      <w:r>
-        <w:rPr>
-          <w:bCs/>
-          <w:b/>
-        </w:rPr>
-        <w:t xml:space="preserve">4</w:t>
-      </w:r>
-      <w:r>
-        <w:t xml:space="preserve"> </w:t>
-      </w:r>
-      <w:r>
-        <w:t xml:space="preserve">- LiteRev (JMIR 2023); LiteRev-Evidence platform; HIV prediction</w:t>
-      </w:r>
-      <w:r>
-        <w:t xml:space="preserve"> </w:t>
-      </w:r>
-      <w:r>
-        <w:t xml:space="preserve">(PLoS ONE 2022); Delta/Omicron severity (CMI Communications 2024).</w:t>
+        <w:t xml:space="preserve">Module 1 - Generation of new ideas, tools, methodologies or knowledge</w:t>
       </w:r>
     </w:p>
     <w:p>
@@ -910,7 +687,7 @@
         <w:t xml:space="preserve"> </w:t>
       </w:r>
       <w:r>
-        <w:t xml:space="preserve">medical services used LiteRev in its methods to structure 138 retained publications.</w:t>
+        <w:t xml:space="preserve">medical services used LiteRev in its published methods.</w:t>
       </w:r>
     </w:p>
     <w:p>
@@ -1066,92 +843,14 @@
         <w:t xml:space="preserve">required close engagement with hospital clinical data and with the people who generate it.</w:t>
       </w:r>
     </w:p>
-    <w:bookmarkEnd w:id="27"/>
-    <w:bookmarkStart w:id="28" w:name="Xfc6d56748425c7eaaacf9212eba9d448dc722da"/>
-    <w:p>
-      <w:pPr>
-        <w:pStyle w:val="Heading1"/>
-      </w:pPr>
-      <w:r>
-        <w:t xml:space="preserve">Module 2: Contributions to the development of other individuals and research teams</w:t>
-      </w:r>
-    </w:p>
-    <w:p>
-      <w:pPr>
-        <w:pStyle w:val="BlockText"/>
-      </w:pPr>
-      <w:r>
-        <w:t xml:space="preserve">Outputs cited here:</w:t>
-      </w:r>
-      <w:r>
-        <w:t xml:space="preserve"> </w:t>
-      </w:r>
-      <w:r>
-        <w:rPr>
-          <w:bCs/>
-          <w:b/>
-        </w:rPr>
-        <w:t xml:space="preserve">2</w:t>
-      </w:r>
-      <w:r>
-        <w:t xml:space="preserve"> </w:t>
-      </w:r>
-      <w:r>
-        <w:t xml:space="preserve">- machine-learning classification of cardiovascular disease history</w:t>
-      </w:r>
-      <w:r>
-        <w:t xml:space="preserve"> </w:t>
-      </w:r>
-      <w:r>
-        <w:t xml:space="preserve">across WHO STEPS surveys (Ng'ambi et al.,</w:t>
-      </w:r>
-      <w:r>
-        <w:t xml:space="preserve"> </w:t>
-      </w:r>
-      <w:r>
-        <w:rPr>
-          <w:bCs/>
-          <w:b/>
-        </w:rPr>
-        <w:t xml:space="preserve">accepted</w:t>
-      </w:r>
-      <w:r>
-        <w:t xml:space="preserve">,</w:t>
-      </w:r>
-      <w:r>
-        <w:t xml:space="preserve"> </w:t>
-      </w:r>
-      <w:r>
-        <w:rPr>
-          <w:bCs/>
-          <w:b/>
-        </w:rPr>
-        <w:t xml:space="preserve">senior author</w:t>
-      </w:r>
-      <w:r>
-        <w:t xml:space="preserve">); AI in emergency</w:t>
-      </w:r>
-      <w:r>
-        <w:t xml:space="preserve"> </w:t>
-      </w:r>
-      <w:r>
-        <w:t xml:space="preserve">medical services: a systematic review (Edjinedja, Larribau,</w:t>
-      </w:r>
-      <w:r>
-        <w:t xml:space="preserve"> </w:t>
-      </w:r>
-      <w:r>
-        <w:rPr>
-          <w:bCs/>
-          <w:b/>
-        </w:rPr>
-        <w:t xml:space="preserve">Orel</w:t>
-      </w:r>
-      <w:r>
-        <w:t xml:space="preserve"> </w:t>
-      </w:r>
-      <w:r>
-        <w:t xml:space="preserve">et al., submitted 2026).</w:t>
+    <w:bookmarkEnd w:id="24"/>
+    <w:bookmarkStart w:id="25" w:name="X7a2886d89382aa82d0efebd34bdae0927762d02"/>
+    <w:p>
+      <w:pPr>
+        <w:pStyle w:val="Heading2"/>
+      </w:pPr>
+      <w:r>
+        <w:t xml:space="preserve">Module 2 - Development of other individuals and research teams</w:t>
       </w:r>
     </w:p>
     <w:p>
@@ -1184,7 +883,7 @@
         <w:t xml:space="preserve"> </w:t>
       </w:r>
       <w:r>
-        <w:t xml:space="preserve">enable other people's research.</w:t>
+        <w:t xml:space="preserve">enable other people’s research.</w:t>
       </w:r>
     </w:p>
     <w:p>
@@ -1214,7 +913,7 @@
         <w:t xml:space="preserve"> </w:t>
       </w:r>
       <w:r>
-        <w:t xml:space="preserve">by Wingston Ng'ambi and</w:t>
+        <w:t xml:space="preserve">by Wingston Ng’ambi and</w:t>
       </w:r>
       <w:r>
         <w:t xml:space="preserve"> </w:t>
@@ -1248,7 +947,7 @@
         <w:t xml:space="preserve"> </w:t>
       </w:r>
       <w:r>
-        <w:t xml:space="preserve">which my role was to direct another researcher's analysis rather than to conduct my own, and it</w:t>
+        <w:t xml:space="preserve">which my role was to direct another researcher’s analysis rather than to conduct my own, and it</w:t>
       </w:r>
       <w:r>
         <w:t xml:space="preserve"> </w:t>
@@ -1356,7 +1055,7 @@
           <w:bCs/>
           <w:b/>
         </w:rPr>
-        <w:t xml:space="preserve">Enabling others' research.</w:t>
+        <w:t xml:space="preserve">Enabling others’ research.</w:t>
       </w:r>
       <w:r>
         <w:t xml:space="preserve"> </w:t>
@@ -1368,7 +1067,7 @@
         <w:t xml:space="preserve"> </w:t>
       </w:r>
       <w:r>
-        <w:t xml:space="preserve">people's work. LiteRev was designed so that researchers without natural language processing</w:t>
+        <w:t xml:space="preserve">people’s work. LiteRev was designed so that researchers without natural language processing</w:t>
       </w:r>
       <w:r>
         <w:t xml:space="preserve"> </w:t>
@@ -1514,99 +1213,14 @@
         <w:t xml:space="preserve">that transition; the grant is what turns a step into a practice.</w:t>
       </w:r>
     </w:p>
-    <w:bookmarkEnd w:id="28"/>
-    <w:bookmarkStart w:id="29" w:name="Xb760de0aca52c9bc0808047fe7f7a65cab0d892"/>
-    <w:p>
-      <w:pPr>
-        <w:pStyle w:val="Heading1"/>
-      </w:pPr>
-      <w:r>
-        <w:t xml:space="preserve">Module 3: Contributions to the wider research and innovation community</w:t>
-      </w:r>
-    </w:p>
-    <w:p>
-      <w:pPr>
-        <w:pStyle w:val="BlockText"/>
-      </w:pPr>
-      <w:r>
-        <w:t xml:space="preserve">Outputs cited here:</w:t>
-      </w:r>
-      <w:r>
-        <w:t xml:space="preserve"> </w:t>
-      </w:r>
-      <w:r>
-        <w:rPr>
-          <w:bCs/>
-          <w:b/>
-        </w:rPr>
-        <w:t xml:space="preserve">2</w:t>
-      </w:r>
-      <w:r>
-        <w:t xml:space="preserve"> </w:t>
-      </w:r>
-      <w:r>
-        <w:t xml:space="preserve">- SARS-CoV-2 seroprevalence, Cameroon (</w:t>
-      </w:r>
-      <w:r>
-        <w:rPr>
-          <w:iCs/>
-          <w:i/>
-        </w:rPr>
-        <w:t xml:space="preserve">Nature Communications</w:t>
-      </w:r>
-      <w:r>
-        <w:t xml:space="preserve">,</w:t>
-      </w:r>
-      <w:r>
-        <w:t xml:space="preserve"> </w:t>
-      </w:r>
-      <w:r>
-        <w:t xml:space="preserve">2021); Future scenarios for the SARS-CoV-2 epidemic in Switzerland (</w:t>
-      </w:r>
-      <w:r>
-        <w:rPr>
-          <w:iCs/>
-          <w:i/>
-        </w:rPr>
-        <w:t xml:space="preserve">F1000Research</w:t>
-      </w:r>
-      <w:r>
-        <w:t xml:space="preserve">, 2020).</w:t>
-      </w:r>
-      <w:r>
-        <w:t xml:space="preserve"> </w:t>
-      </w:r>
-      <w:r>
-        <w:t xml:space="preserve">(</w:t>
-      </w:r>
-      <w:r>
-        <w:rPr>
-          <w:iCs/>
-          <w:i/>
-        </w:rPr>
-        <w:t xml:space="preserve">BMC Public Health</w:t>
-      </w:r>
-      <w:r>
-        <w:t xml:space="preserve"> </w:t>
-      </w:r>
-      <w:r>
-        <w:t xml:space="preserve">2022 and</w:t>
-      </w:r>
-      <w:r>
-        <w:t xml:space="preserve"> </w:t>
-      </w:r>
-      <w:r>
-        <w:rPr>
-          <w:iCs/>
-          <w:i/>
-        </w:rPr>
-        <w:t xml:space="preserve">Epidemiology &amp; Infection</w:t>
-      </w:r>
-      <w:r>
-        <w:t xml:space="preserve"> </w:t>
-      </w:r>
-      <w:r>
-        <w:t xml:space="preserve">appear as narrative context only.)</w:t>
+    <w:bookmarkEnd w:id="25"/>
+    <w:bookmarkStart w:id="26" w:name="X5237f3440d0fbef745814ab111e4391bc87a1d1"/>
+    <w:p>
+      <w:pPr>
+        <w:pStyle w:val="Heading2"/>
+      </w:pPr>
+      <w:r>
+        <w:t xml:space="preserve">Module 3 - Contributions to the wider research and innovation community</w:t>
       </w:r>
     </w:p>
     <w:p>
@@ -1972,50 +1586,14 @@
         <w:t xml:space="preserve">underlying problems are structurally similar and the tools are largely unknown.</w:t>
       </w:r>
     </w:p>
-    <w:bookmarkEnd w:id="29"/>
-    <w:bookmarkStart w:id="30" w:name="Xd02c82d5f0e030bd42e75d55ee0d7c0a58e5ff9"/>
-    <w:p>
-      <w:pPr>
-        <w:pStyle w:val="Heading1"/>
-      </w:pPr>
-      <w:r>
-        <w:t xml:space="preserve">Module 4: Impact beyond the scientific community, for broader society</w:t>
-      </w:r>
-    </w:p>
-    <w:p>
-      <w:pPr>
-        <w:pStyle w:val="BlockText"/>
-      </w:pPr>
-      <w:r>
-        <w:t xml:space="preserve">Outputs cited here:</w:t>
-      </w:r>
-      <w:r>
-        <w:t xml:space="preserve"> </w:t>
-      </w:r>
-      <w:r>
-        <w:rPr>
-          <w:bCs/>
-          <w:b/>
-        </w:rPr>
-        <w:t xml:space="preserve">2</w:t>
-      </w:r>
-      <w:r>
-        <w:t xml:space="preserve"> </w:t>
-      </w:r>
-      <w:r>
-        <w:t xml:space="preserve">- COVID-19 epidemiological dashboard for the WHO African Region</w:t>
-      </w:r>
-      <w:r>
-        <w:t xml:space="preserve"> </w:t>
-      </w:r>
-      <w:r>
-        <w:t xml:space="preserve">(research resource); Legionellosis in Geneva: linked case–installation study, BASEC 2026-00324</w:t>
-      </w:r>
-      <w:r>
-        <w:t xml:space="preserve"> </w:t>
-      </w:r>
-      <w:r>
-        <w:t xml:space="preserve">(protocol and dataset, with secured cantonal funding).</w:t>
+    <w:bookmarkEnd w:id="26"/>
+    <w:bookmarkStart w:id="27" w:name="Xd88c382c828cb97d20b5b045e2bc3a80aa88057"/>
+    <w:p>
+      <w:pPr>
+        <w:pStyle w:val="Heading2"/>
+      </w:pPr>
+      <w:r>
+        <w:t xml:space="preserve">Module 4 - Impact beyond the scientific community, for broader society</w:t>
       </w:r>
     </w:p>
     <w:p>
@@ -2136,7 +1714,7 @@
           <w:bCs/>
           <w:b/>
         </w:rPr>
-        <w:t xml:space="preserve">l'énergie, and the Service du Médecin Cantonal</w:t>
+        <w:t xml:space="preserve">l’énergie, and the Service du Médecin Cantonal</w:t>
       </w:r>
       <w:r>
         <w:t xml:space="preserve"> </w:t>
@@ -2340,14 +1918,14 @@
         <w:t xml:space="preserve">contribution rather than an implementation detail.</w:t>
       </w:r>
     </w:p>
-    <w:bookmarkEnd w:id="30"/>
-    <w:bookmarkStart w:id="36" w:name="research-output-list-10-items"/>
-    <w:p>
-      <w:pPr>
-        <w:pStyle w:val="Heading1"/>
-      </w:pPr>
-      <w:r>
-        <w:t xml:space="preserve">Research output list: 10 items</w:t>
+    <w:bookmarkEnd w:id="27"/>
+    <w:bookmarkStart w:id="28" w:name="X8d0af6e110c0b2a9dd7ba97f77149217c30f330"/>
+    <w:p>
+      <w:pPr>
+        <w:pStyle w:val="Heading2"/>
+      </w:pPr>
+      <w:r>
+        <w:t xml:space="preserve">Research output list (10 outputs, with contribution statements)</w:t>
       </w:r>
     </w:p>
     <w:p>
@@ -2426,7 +2004,8 @@
         </w:pict>
       </w:r>
     </w:p>
-    <w:bookmarkStart w:id="31" w:name="X16d2b9b2b4a244a2a742463b2ad51db052eac8d"/>
+    <w:bookmarkEnd w:id="28"/>
+    <w:bookmarkStart w:id="29" w:name="X16d2b9b2b4a244a2a742463b2ad51db052eac8d"/>
     <w:p>
       <w:pPr>
         <w:pStyle w:val="Heading2"/>
@@ -2480,92 +2059,169 @@
     </w:p>
     <w:p>
       <w:pPr>
-        <w:pStyle w:val="BlockText"/>
-      </w:pPr>
+        <w:pStyle w:val="BodyText"/>
+      </w:pPr>
+      <w:r>
+        <w:rPr>
+          <w:bCs/>
+          <w:b/>
+        </w:rPr>
+        <w:t xml:space="preserve">2. Orel E.</w:t>
+      </w:r>
+      <w:r>
+        <w:t xml:space="preserve"> </w:t>
+      </w:r>
+      <w:r>
+        <w:t xml:space="preserve">LiteRev-Evidence: a platform for structured quantitative evidence extraction and</w:t>
+      </w:r>
+      <w:r>
+        <w:t xml:space="preserve"> </w:t>
+      </w:r>
+      <w:r>
+        <w:t xml:space="preserve">scenario modelling. Software and research resource, 2024–. literev-scenario.com</w:t>
+      </w:r>
+    </w:p>
+    <w:p>
+      <w:pPr>
+        <w:pStyle w:val="BodyText"/>
+      </w:pPr>
+      <w:r>
+        <w:rPr>
+          <w:bCs/>
+          <w:b/>
+        </w:rPr>
+        <w:t xml:space="preserve">3. Orel E</w:t>
+      </w:r>
+      <w:r>
+        <w:t xml:space="preserve">, Esra R, Estill J, Thiabaud A, Marchand-Maillet S, Merzouki A, Keiser O.</w:t>
+      </w:r>
+      <w:r>
+        <w:t xml:space="preserve"> </w:t>
+      </w:r>
+      <w:r>
+        <w:t xml:space="preserve">Prediction of HIV status based on socio-behavioural characteristics in East and Southern Africa.</w:t>
+      </w:r>
+      <w:r>
+        <w:t xml:space="preserve"> </w:t>
+      </w:r>
       <w:r>
         <w:rPr>
           <w:iCs/>
           <w:i/>
         </w:rPr>
-        <w:t xml:space="preserve">Contribution:</w:t>
-      </w:r>
-      <w:r>
-        <w:t xml:space="preserve"> </w:t>
-      </w:r>
-      <w:r>
-        <w:t xml:space="preserve">First author. Conceived the tool, designed and implemented the NLP,</w:t>
-      </w:r>
-      <w:r>
-        <w:t xml:space="preserve"> </w:t>
-      </w:r>
-      <w:r>
-        <w:t xml:space="preserve">dimensionality-reduction and clustering pipeline, conducted the performance evaluation, wrote</w:t>
-      </w:r>
-      <w:r>
-        <w:t xml:space="preserve"> </w:t>
-      </w:r>
-      <w:r>
-        <w:t xml:space="preserve">the manuscript. Now used by other groups, including in the systematic review at item 5.</w:t>
-      </w:r>
-    </w:p>
-    <w:p>
-      <w:pPr>
-        <w:pStyle w:val="FirstParagraph"/>
-      </w:pPr>
-      <w:r>
-        <w:rPr>
-          <w:bCs/>
-          <w:b/>
-        </w:rPr>
-        <w:t xml:space="preserve">2. Orel E.</w:t>
-      </w:r>
-      <w:r>
-        <w:t xml:space="preserve"> </w:t>
-      </w:r>
-      <w:r>
-        <w:t xml:space="preserve">LiteRev-Evidence: a platform for structured quantitative evidence extraction and</w:t>
-      </w:r>
-      <w:r>
-        <w:t xml:space="preserve"> </w:t>
-      </w:r>
-      <w:r>
-        <w:t xml:space="preserve">scenario modelling. Software and research resource, 2024–. literev-scenario.com</w:t>
-      </w:r>
-    </w:p>
-    <w:p>
-      <w:pPr>
-        <w:pStyle w:val="BlockText"/>
-      </w:pPr>
+        <w:t xml:space="preserve">PLoS ONE</w:t>
+      </w:r>
+      <w:r>
+        <w:t xml:space="preserve"> </w:t>
+      </w:r>
+      <w:r>
+        <w:t xml:space="preserve">2022;17(3):e0264429.</w:t>
+      </w:r>
+    </w:p>
+    <w:p>
+      <w:pPr>
+        <w:pStyle w:val="BodyText"/>
+      </w:pPr>
+      <w:r>
+        <w:rPr>
+          <w:bCs/>
+          <w:b/>
+        </w:rPr>
+        <w:t xml:space="preserve">4. Orel E</w:t>
+      </w:r>
+      <w:r>
+        <w:t xml:space="preserve">, Sobel J, Zanella MC, Iten A, Kaiser L, Keiser O, Vetter P.</w:t>
+      </w:r>
+      <w:r>
+        <w:t xml:space="preserve"> </w:t>
+      </w:r>
+      <w:r>
+        <w:t xml:space="preserve">Difference in clinical severity between Delta variant and Omicron sub-lineages in a Swiss</w:t>
+      </w:r>
+      <w:r>
+        <w:t xml:space="preserve"> </w:t>
+      </w:r>
+      <w:r>
+        <w:t xml:space="preserve">tertiary center.</w:t>
+      </w:r>
+      <w:r>
+        <w:t xml:space="preserve"> </w:t>
+      </w:r>
       <w:r>
         <w:rPr>
           <w:iCs/>
           <w:i/>
         </w:rPr>
-        <w:t xml:space="preserve">Contribution:</w:t>
-      </w:r>
-      <w:r>
-        <w:t xml:space="preserve"> </w:t>
-      </w:r>
-      <w:r>
-        <w:t xml:space="preserve">Sole architect and developer. The full review pipeline in working form:</w:t>
-      </w:r>
-      <w:r>
-        <w:t xml:space="preserve"> </w:t>
-      </w:r>
-      <w:r>
-        <w:t xml:space="preserve">live federated search of the open literature from natural-language or Boolean queries,</w:t>
-      </w:r>
-      <w:r>
-        <w:t xml:space="preserve"> </w:t>
-      </w:r>
-      <w:r>
-        <w:t xml:space="preserve">screening, living reviews, provenance-tracked and quality-weighted extraction pooled into</w:t>
-      </w:r>
-      <w:r>
-        <w:t xml:space="preserve"> </w:t>
-      </w:r>
-      <w:r>
-        <w:t xml:space="preserve">parameter distributions, and the modelling components that consume them.</w:t>
+        <w:t xml:space="preserve">CMI Communications</w:t>
+      </w:r>
+      <w:r>
+        <w:t xml:space="preserve"> </w:t>
+      </w:r>
+      <w:r>
+        <w:t xml:space="preserve">2024.</w:t>
+      </w:r>
+    </w:p>
+    <w:bookmarkEnd w:id="29"/>
+    <w:bookmarkStart w:id="30" w:name="X74c655e24a89249cd8a748e3c3241863085d74b"/>
+    <w:p>
+      <w:pPr>
+        <w:pStyle w:val="Heading2"/>
+      </w:pPr>
+      <w:r>
+        <w:t xml:space="preserve">Module 2: Development of other individuals and research teams (2)</w:t>
+      </w:r>
+    </w:p>
+    <w:p>
+      <w:pPr>
+        <w:pStyle w:val="FirstParagraph"/>
+      </w:pPr>
+      <w:r>
+        <w:rPr>
+          <w:bCs/>
+          <w:b/>
+        </w:rPr>
+        <w:t xml:space="preserve">5.</w:t>
+      </w:r>
+      <w:r>
+        <w:t xml:space="preserve"> </w:t>
+      </w:r>
+      <w:r>
+        <w:t xml:space="preserve">Ng’ambi W, Estill J, Keiser O, Merzouki FA,</w:t>
+      </w:r>
+      <w:r>
+        <w:t xml:space="preserve"> </w:t>
+      </w:r>
+      <w:r>
+        <w:rPr>
+          <w:bCs/>
+          <w:b/>
+        </w:rPr>
+        <w:t xml:space="preserve">Orel E</w:t>
+      </w:r>
+      <w:r>
+        <w:t xml:space="preserve">.</w:t>
+      </w:r>
+      <w:r>
+        <w:t xml:space="preserve"> </w:t>
+      </w:r>
+      <w:r>
+        <w:t xml:space="preserve">Machine learning-based classification of self-reported cardiovascular disease history in Africa</w:t>
+      </w:r>
+      <w:r>
+        <w:t xml:space="preserve"> </w:t>
+      </w:r>
+      <w:r>
+        <w:t xml:space="preserve">using harmonised multi-country WHO STEPS surveys: 2014–2019.</w:t>
+      </w:r>
+      <w:r>
+        <w:t xml:space="preserve"> </w:t>
+      </w:r>
+      <w:r>
+        <w:rPr>
+          <w:bCs/>
+          <w:b/>
+        </w:rPr>
+        <w:t xml:space="preserve">Accepted for publication.</w:t>
       </w:r>
       <w:r>
         <w:t xml:space="preserve"> </w:t>
@@ -2574,7 +2230,75 @@
         <w:rPr>
           <w:rStyle w:val="VerbatimChar"/>
         </w:rPr>
-        <w:t xml:space="preserve">[[Consider depositing a versioned release with a DOI (Zenodo) before submission - a citable identifier makes a software output count as an output rather than as a claim.]]</w:t>
+        <w:t xml:space="preserve">[[Venue, year, DOI once assigned]]</w:t>
+      </w:r>
+    </w:p>
+    <w:p>
+      <w:pPr>
+        <w:pStyle w:val="BodyText"/>
+      </w:pPr>
+      <w:r>
+        <w:rPr>
+          <w:bCs/>
+          <w:b/>
+        </w:rPr>
+        <w:t xml:space="preserve">6.</w:t>
+      </w:r>
+      <w:r>
+        <w:t xml:space="preserve"> </w:t>
+      </w:r>
+      <w:r>
+        <w:t xml:space="preserve">Edjinedja KL, Larribau R,</w:t>
+      </w:r>
+      <w:r>
+        <w:t xml:space="preserve"> </w:t>
+      </w:r>
+      <w:r>
+        <w:rPr>
+          <w:bCs/>
+          <w:b/>
+        </w:rPr>
+        <w:t xml:space="preserve">Orel E</w:t>
+      </w:r>
+      <w:r>
+        <w:t xml:space="preserve">, Cossus J, Elfahim O, Yendouname K, Vaussenat F,</w:t>
+      </w:r>
+      <w:r>
+        <w:t xml:space="preserve"> </w:t>
+      </w:r>
+      <w:r>
+        <w:t xml:space="preserve">Teodoro D, Robert-Nicoud S, Barakat O, Desmettre T.</w:t>
+      </w:r>
+      <w:r>
+        <w:t xml:space="preserve"> </w:t>
+      </w:r>
+      <w:r>
+        <w:t xml:space="preserve">Artificial intelligence in emergency medical services for disasters and health emergencies:</w:t>
+      </w:r>
+      <w:r>
+        <w:t xml:space="preserve"> </w:t>
+      </w:r>
+      <w:r>
+        <w:t xml:space="preserve">a systematic review.</w:t>
+      </w:r>
+      <w:r>
+        <w:t xml:space="preserve"> </w:t>
+      </w:r>
+      <w:r>
+        <w:rPr>
+          <w:rStyle w:val="VerbatimChar"/>
+        </w:rPr>
+        <w:t xml:space="preserve">[[Submitted 2026 - update status and venue]]</w:t>
+      </w:r>
+    </w:p>
+    <w:bookmarkEnd w:id="30"/>
+    <w:bookmarkStart w:id="31" w:name="Xe4a83e14d7c14eb91d8c73a097532799e64e66d"/>
+    <w:p>
+      <w:pPr>
+        <w:pStyle w:val="Heading2"/>
+      </w:pPr>
+      <w:r>
+        <w:t xml:space="preserve">Module 3: Contributions to the wider research and innovation community (2)</w:t>
       </w:r>
     </w:p>
     <w:p>
@@ -2586,16 +2310,38 @@
           <w:bCs/>
           <w:b/>
         </w:rPr>
-        <w:t xml:space="preserve">3. Orel E</w:t>
-      </w:r>
-      <w:r>
-        <w:t xml:space="preserve">, Esra R, Estill J, Thiabaud A, Marchand-Maillet S, Merzouki A, Keiser O.</w:t>
-      </w:r>
-      <w:r>
-        <w:t xml:space="preserve"> </w:t>
-      </w:r>
-      <w:r>
-        <w:t xml:space="preserve">Prediction of HIV status based on socio-behavioural characteristics in East and Southern Africa.</w:t>
+        <w:t xml:space="preserve">7.</w:t>
+      </w:r>
+      <w:r>
+        <w:t xml:space="preserve"> </w:t>
+      </w:r>
+      <w:r>
+        <w:t xml:space="preserve">Nwosu KD, Fokam J, Wanda F, Mama L,</w:t>
+      </w:r>
+      <w:r>
+        <w:t xml:space="preserve"> </w:t>
+      </w:r>
+      <w:r>
+        <w:rPr>
+          <w:bCs/>
+          <w:b/>
+        </w:rPr>
+        <w:t xml:space="preserve">Orel E</w:t>
+      </w:r>
+      <w:r>
+        <w:t xml:space="preserve">, Ray N, Meke J, Tassegning A, Takou D,</w:t>
+      </w:r>
+      <w:r>
+        <w:t xml:space="preserve"> </w:t>
+      </w:r>
+      <w:r>
+        <w:t xml:space="preserve">Mimbe E, Stoll B, Guillebert J, Comte E, Keiser O, Ciaffi L.</w:t>
+      </w:r>
+      <w:r>
+        <w:t xml:space="preserve"> </w:t>
+      </w:r>
+      <w:r>
+        <w:t xml:space="preserve">SARS-CoV-2 antibody seroprevalence and associated risk factors in an urban district in Cameroon.</w:t>
       </w:r>
       <w:r>
         <w:t xml:space="preserve"> </w:t>
@@ -2605,37 +2351,76 @@
           <w:iCs/>
           <w:i/>
         </w:rPr>
-        <w:t xml:space="preserve">PLoS ONE</w:t>
-      </w:r>
-      <w:r>
-        <w:t xml:space="preserve"> </w:t>
-      </w:r>
-      <w:r>
-        <w:t xml:space="preserve">2022;17(3):e0264429.</w:t>
-      </w:r>
-    </w:p>
-    <w:p>
-      <w:pPr>
-        <w:pStyle w:val="BlockText"/>
-      </w:pPr>
+        <w:t xml:space="preserve">Nature Communications</w:t>
+      </w:r>
+      <w:r>
+        <w:t xml:space="preserve"> </w:t>
+      </w:r>
+      <w:r>
+        <w:t xml:space="preserve">2021;12:5851. doi:10.1038/s41467-021-25946-0</w:t>
+      </w:r>
+    </w:p>
+    <w:p>
+      <w:pPr>
+        <w:pStyle w:val="BodyText"/>
+      </w:pPr>
+      <w:r>
+        <w:rPr>
+          <w:bCs/>
+          <w:b/>
+        </w:rPr>
+        <w:t xml:space="preserve">8.</w:t>
+      </w:r>
+      <w:r>
+        <w:t xml:space="preserve"> </w:t>
+      </w:r>
+      <w:r>
+        <w:t xml:space="preserve">Estill J, Venkova-Marchevska P, Roelens M,</w:t>
+      </w:r>
+      <w:r>
+        <w:t xml:space="preserve"> </w:t>
+      </w:r>
+      <w:r>
+        <w:rPr>
+          <w:bCs/>
+          <w:b/>
+        </w:rPr>
+        <w:t xml:space="preserve">Orel E</w:t>
+      </w:r>
+      <w:r>
+        <w:t xml:space="preserve">, Temerev A, Flahault A, Keiser O.</w:t>
+      </w:r>
+      <w:r>
+        <w:t xml:space="preserve"> </w:t>
+      </w:r>
+      <w:r>
+        <w:t xml:space="preserve">Future scenarios for the SARS-CoV-2 epidemic in Switzerland: an age-structured model.</w:t>
+      </w:r>
+      <w:r>
+        <w:t xml:space="preserve"> </w:t>
+      </w:r>
       <w:r>
         <w:rPr>
           <w:iCs/>
           <w:i/>
         </w:rPr>
-        <w:t xml:space="preserve">Contribution:</w:t>
-      </w:r>
-      <w:r>
-        <w:t xml:space="preserve"> </w:t>
-      </w:r>
-      <w:r>
-        <w:t xml:space="preserve">First author. Designed the analysis, implemented the gradient-boosted models,</w:t>
-      </w:r>
-      <w:r>
-        <w:t xml:space="preserve"> </w:t>
-      </w:r>
-      <w:r>
-        <w:t xml:space="preserve">conducted the cross-country transportability assessment, wrote the manuscript.</w:t>
+        <w:t xml:space="preserve">F1000Research</w:t>
+      </w:r>
+      <w:r>
+        <w:t xml:space="preserve"> </w:t>
+      </w:r>
+      <w:r>
+        <w:t xml:space="preserve">2020;9.</w:t>
+      </w:r>
+    </w:p>
+    <w:bookmarkEnd w:id="31"/>
+    <w:bookmarkStart w:id="32" w:name="Xb0ea19ac6a8b59dbd895712f9d00d9d37e6deac"/>
+    <w:p>
+      <w:pPr>
+        <w:pStyle w:val="Heading2"/>
+      </w:pPr>
+      <w:r>
+        <w:t xml:space="preserve">Module 4: Impact beyond the scientific community (2)</w:t>
       </w:r>
     </w:p>
     <w:p>
@@ -2647,456 +2432,6 @@
           <w:bCs/>
           <w:b/>
         </w:rPr>
-        <w:t xml:space="preserve">4. Orel E</w:t>
-      </w:r>
-      <w:r>
-        <w:t xml:space="preserve">, Sobel J, Zanella MC, Iten A, Kaiser L, Keiser O, Vetter P.</w:t>
-      </w:r>
-      <w:r>
-        <w:t xml:space="preserve"> </w:t>
-      </w:r>
-      <w:r>
-        <w:t xml:space="preserve">Difference in clinical severity between Delta variant and Omicron sub-lineages in a Swiss</w:t>
-      </w:r>
-      <w:r>
-        <w:t xml:space="preserve"> </w:t>
-      </w:r>
-      <w:r>
-        <w:t xml:space="preserve">tertiary center.</w:t>
-      </w:r>
-      <w:r>
-        <w:t xml:space="preserve"> </w:t>
-      </w:r>
-      <w:r>
-        <w:rPr>
-          <w:iCs/>
-          <w:i/>
-        </w:rPr>
-        <w:t xml:space="preserve">CMI Communications</w:t>
-      </w:r>
-      <w:r>
-        <w:t xml:space="preserve"> </w:t>
-      </w:r>
-      <w:r>
-        <w:t xml:space="preserve">2024.</w:t>
-      </w:r>
-    </w:p>
-    <w:p>
-      <w:pPr>
-        <w:pStyle w:val="BlockText"/>
-      </w:pPr>
-      <w:r>
-        <w:rPr>
-          <w:iCs/>
-          <w:i/>
-        </w:rPr>
-        <w:t xml:space="preserve">Contribution:</w:t>
-      </w:r>
-      <w:r>
-        <w:t xml:space="preserve"> </w:t>
-      </w:r>
-      <w:r>
-        <w:t xml:space="preserve">First author. Designed and conducted the analysis of hospital clinical data,</w:t>
-      </w:r>
-      <w:r>
-        <w:t xml:space="preserve"> </w:t>
-      </w:r>
-      <w:r>
-        <w:t xml:space="preserve">wrote the manuscript.</w:t>
-      </w:r>
-    </w:p>
-    <w:bookmarkEnd w:id="31"/>
-    <w:bookmarkStart w:id="32" w:name="X74c655e24a89249cd8a748e3c3241863085d74b"/>
-    <w:p>
-      <w:pPr>
-        <w:pStyle w:val="Heading2"/>
-      </w:pPr>
-      <w:r>
-        <w:t xml:space="preserve">Module 2: Development of other individuals and research teams (2)</w:t>
-      </w:r>
-    </w:p>
-    <w:p>
-      <w:pPr>
-        <w:pStyle w:val="FirstParagraph"/>
-      </w:pPr>
-      <w:r>
-        <w:rPr>
-          <w:bCs/>
-          <w:b/>
-        </w:rPr>
-        <w:t xml:space="preserve">5.</w:t>
-      </w:r>
-      <w:r>
-        <w:t xml:space="preserve"> </w:t>
-      </w:r>
-      <w:r>
-        <w:t xml:space="preserve">Ng'ambi W, Estill J, Keiser O, Merzouki FA,</w:t>
-      </w:r>
-      <w:r>
-        <w:t xml:space="preserve"> </w:t>
-      </w:r>
-      <w:r>
-        <w:rPr>
-          <w:bCs/>
-          <w:b/>
-        </w:rPr>
-        <w:t xml:space="preserve">Orel E</w:t>
-      </w:r>
-      <w:r>
-        <w:t xml:space="preserve">.</w:t>
-      </w:r>
-      <w:r>
-        <w:t xml:space="preserve"> </w:t>
-      </w:r>
-      <w:r>
-        <w:t xml:space="preserve">Machine learning-based classification of self-reported cardiovascular disease history in Africa</w:t>
-      </w:r>
-      <w:r>
-        <w:t xml:space="preserve"> </w:t>
-      </w:r>
-      <w:r>
-        <w:t xml:space="preserve">using harmonised multi-country WHO STEPS surveys: 2014–2019.</w:t>
-      </w:r>
-      <w:r>
-        <w:t xml:space="preserve"> </w:t>
-      </w:r>
-      <w:r>
-        <w:rPr>
-          <w:bCs/>
-          <w:b/>
-        </w:rPr>
-        <w:t xml:space="preserve">Accepted for publication.</w:t>
-      </w:r>
-      <w:r>
-        <w:t xml:space="preserve"> </w:t>
-      </w:r>
-      <w:r>
-        <w:rPr>
-          <w:rStyle w:val="VerbatimChar"/>
-        </w:rPr>
-        <w:t xml:space="preserve">[[Venue, year, DOI once assigned]]</w:t>
-      </w:r>
-    </w:p>
-    <w:p>
-      <w:pPr>
-        <w:pStyle w:val="BlockText"/>
-      </w:pPr>
-      <w:r>
-        <w:rPr>
-          <w:iCs/>
-          <w:i/>
-        </w:rPr>
-        <w:t xml:space="preserve">Contribution:</w:t>
-      </w:r>
-      <w:r>
-        <w:t xml:space="preserve"> </w:t>
-      </w:r>
-      <w:r>
-        <w:rPr>
-          <w:bCs/>
-          <w:b/>
-        </w:rPr>
-        <w:t xml:space="preserve">Last (senior) author.</w:t>
-      </w:r>
-      <w:r>
-        <w:t xml:space="preserve"> </w:t>
-      </w:r>
-      <w:r>
-        <w:rPr>
-          <w:rStyle w:val="VerbatimChar"/>
-        </w:rPr>
-        <w:t xml:space="preserve">[[State the actual role in one precise line - e.g. supervised the machine-learning methodology and analysis design, guided the revision.]]</w:t>
-      </w:r>
-      <w:r>
-        <w:t xml:space="preserve"> </w:t>
-      </w:r>
-      <w:r>
-        <w:t xml:space="preserve">Senior-authoring the work of the first author marks the transition from contributing to</w:t>
-      </w:r>
-      <w:r>
-        <w:t xml:space="preserve"> </w:t>
-      </w:r>
-      <w:r>
-        <w:t xml:space="preserve">collaborative analyses to directing them.</w:t>
-      </w:r>
-    </w:p>
-    <w:p>
-      <w:pPr>
-        <w:pStyle w:val="FirstParagraph"/>
-      </w:pPr>
-      <w:r>
-        <w:rPr>
-          <w:bCs/>
-          <w:b/>
-        </w:rPr>
-        <w:t xml:space="preserve">6.</w:t>
-      </w:r>
-      <w:r>
-        <w:t xml:space="preserve"> </w:t>
-      </w:r>
-      <w:r>
-        <w:t xml:space="preserve">Edjinedja KL, Larribau R,</w:t>
-      </w:r>
-      <w:r>
-        <w:t xml:space="preserve"> </w:t>
-      </w:r>
-      <w:r>
-        <w:rPr>
-          <w:bCs/>
-          <w:b/>
-        </w:rPr>
-        <w:t xml:space="preserve">Orel E</w:t>
-      </w:r>
-      <w:r>
-        <w:t xml:space="preserve">, Cossus J, Elfahim O, Yendouname K, Vaussenat F,</w:t>
-      </w:r>
-      <w:r>
-        <w:t xml:space="preserve"> </w:t>
-      </w:r>
-      <w:r>
-        <w:t xml:space="preserve">Teodoro D, Robert-Nicoud S, Barakat O, Desmettre T.</w:t>
-      </w:r>
-      <w:r>
-        <w:t xml:space="preserve"> </w:t>
-      </w:r>
-      <w:r>
-        <w:t xml:space="preserve">Artificial intelligence in emergency medical services for disasters and health emergencies:</w:t>
-      </w:r>
-      <w:r>
-        <w:t xml:space="preserve"> </w:t>
-      </w:r>
-      <w:r>
-        <w:t xml:space="preserve">a systematic review.</w:t>
-      </w:r>
-      <w:r>
-        <w:t xml:space="preserve"> </w:t>
-      </w:r>
-      <w:r>
-        <w:rPr>
-          <w:rStyle w:val="VerbatimChar"/>
-        </w:rPr>
-        <w:t xml:space="preserve">[[Submitted 2026 - update status and venue]]</w:t>
-      </w:r>
-    </w:p>
-    <w:p>
-      <w:pPr>
-        <w:pStyle w:val="BlockText"/>
-      </w:pPr>
-      <w:r>
-        <w:rPr>
-          <w:iCs/>
-          <w:i/>
-        </w:rPr>
-        <w:t xml:space="preserve">Contribution:</w:t>
-      </w:r>
-      <w:r>
-        <w:t xml:space="preserve"> </w:t>
-      </w:r>
-      <w:r>
-        <w:t xml:space="preserve">Third author. Provided the methodological infrastructure (LiteRev, used in the</w:t>
-      </w:r>
-      <w:r>
-        <w:t xml:space="preserve"> </w:t>
-      </w:r>
-      <w:r>
-        <w:t xml:space="preserve">published methods to structure 138 retained publications) and guided its application through</w:t>
-      </w:r>
-      <w:r>
-        <w:t xml:space="preserve"> </w:t>
-      </w:r>
-      <w:r>
-        <w:t xml:space="preserve">screening and clustering, working with the doctoral researcher leading the review.</w:t>
-      </w:r>
-    </w:p>
-    <w:bookmarkEnd w:id="32"/>
-    <w:bookmarkStart w:id="33" w:name="Xe4a83e14d7c14eb91d8c73a097532799e64e66d"/>
-    <w:p>
-      <w:pPr>
-        <w:pStyle w:val="Heading2"/>
-      </w:pPr>
-      <w:r>
-        <w:t xml:space="preserve">Module 3: Contributions to the wider research and innovation community (2)</w:t>
-      </w:r>
-    </w:p>
-    <w:p>
-      <w:pPr>
-        <w:pStyle w:val="FirstParagraph"/>
-      </w:pPr>
-      <w:r>
-        <w:rPr>
-          <w:bCs/>
-          <w:b/>
-        </w:rPr>
-        <w:t xml:space="preserve">7.</w:t>
-      </w:r>
-      <w:r>
-        <w:t xml:space="preserve"> </w:t>
-      </w:r>
-      <w:r>
-        <w:t xml:space="preserve">Nwosu K, Fokam J, Wanda F, Mama L,</w:t>
-      </w:r>
-      <w:r>
-        <w:t xml:space="preserve"> </w:t>
-      </w:r>
-      <w:r>
-        <w:rPr>
-          <w:bCs/>
-          <w:b/>
-        </w:rPr>
-        <w:t xml:space="preserve">Orel E</w:t>
-      </w:r>
-      <w:r>
-        <w:t xml:space="preserve">, Ray N, Meke J, et al.</w:t>
-      </w:r>
-      <w:r>
-        <w:t xml:space="preserve"> </w:t>
-      </w:r>
-      <w:r>
-        <w:t xml:space="preserve">SARS-CoV-2 antibody seroprevalence and associated risk factors in an urban district in Cameroon.</w:t>
-      </w:r>
-      <w:r>
-        <w:t xml:space="preserve"> </w:t>
-      </w:r>
-      <w:r>
-        <w:rPr>
-          <w:iCs/>
-          <w:i/>
-        </w:rPr>
-        <w:t xml:space="preserve">Nature Communications</w:t>
-      </w:r>
-      <w:r>
-        <w:t xml:space="preserve"> </w:t>
-      </w:r>
-      <w:r>
-        <w:t xml:space="preserve">2021;12:5851.</w:t>
-      </w:r>
-    </w:p>
-    <w:p>
-      <w:pPr>
-        <w:pStyle w:val="BlockText"/>
-      </w:pPr>
-      <w:r>
-        <w:rPr>
-          <w:iCs/>
-          <w:i/>
-        </w:rPr>
-        <w:t xml:space="preserve">Contribution:</w:t>
-      </w:r>
-      <w:r>
-        <w:t xml:space="preserve"> </w:t>
-      </w:r>
-      <w:r>
-        <w:rPr>
-          <w:rStyle w:val="VerbatimChar"/>
-        </w:rPr>
-        <w:t xml:space="preserve">[[State your specific role - statistical analysis? risk factor modelling? One precise line is worth more than the author position, and this is your highest-visibility venue.]]</w:t>
-      </w:r>
-    </w:p>
-    <w:p>
-      <w:pPr>
-        <w:pStyle w:val="FirstParagraph"/>
-      </w:pPr>
-      <w:r>
-        <w:rPr>
-          <w:bCs/>
-          <w:b/>
-        </w:rPr>
-        <w:t xml:space="preserve">8.</w:t>
-      </w:r>
-      <w:r>
-        <w:t xml:space="preserve"> </w:t>
-      </w:r>
-      <w:r>
-        <w:t xml:space="preserve">Estill J, Venkova-Marchevska P, Roelens M,</w:t>
-      </w:r>
-      <w:r>
-        <w:t xml:space="preserve"> </w:t>
-      </w:r>
-      <w:r>
-        <w:rPr>
-          <w:bCs/>
-          <w:b/>
-        </w:rPr>
-        <w:t xml:space="preserve">Orel E</w:t>
-      </w:r>
-      <w:r>
-        <w:t xml:space="preserve">, Temerev A, Flahault A, Keiser O.</w:t>
-      </w:r>
-      <w:r>
-        <w:t xml:space="preserve"> </w:t>
-      </w:r>
-      <w:r>
-        <w:t xml:space="preserve">Future scenarios for the SARS-CoV-2 epidemic in Switzerland: an age-structured model.</w:t>
-      </w:r>
-      <w:r>
-        <w:t xml:space="preserve"> </w:t>
-      </w:r>
-      <w:r>
-        <w:rPr>
-          <w:iCs/>
-          <w:i/>
-        </w:rPr>
-        <w:t xml:space="preserve">F1000Research</w:t>
-      </w:r>
-      <w:r>
-        <w:t xml:space="preserve"> </w:t>
-      </w:r>
-      <w:r>
-        <w:t xml:space="preserve">2020;9.</w:t>
-      </w:r>
-    </w:p>
-    <w:p>
-      <w:pPr>
-        <w:pStyle w:val="BlockText"/>
-      </w:pPr>
-      <w:r>
-        <w:rPr>
-          <w:iCs/>
-          <w:i/>
-        </w:rPr>
-        <w:t xml:space="preserve">Contribution:</w:t>
-      </w:r>
-      <w:r>
-        <w:t xml:space="preserve"> </w:t>
-      </w:r>
-      <w:r>
-        <w:rPr>
-          <w:rStyle w:val="VerbatimChar"/>
-        </w:rPr>
-        <w:t xml:space="preserve">[[Specify - model implementation? scenario design?]]</w:t>
-      </w:r>
-      <w:r>
-        <w:t xml:space="preserve"> </w:t>
-      </w:r>
-      <w:r>
-        <w:t xml:space="preserve">Contributed to</w:t>
-      </w:r>
-      <w:r>
-        <w:t xml:space="preserve"> </w:t>
-      </w:r>
-      <w:r>
-        <w:t xml:space="preserve">age-structured scenario modelling produced for Swiss pandemic planning under time pressure.</w:t>
-      </w:r>
-    </w:p>
-    <w:bookmarkEnd w:id="33"/>
-    <w:bookmarkStart w:id="34" w:name="Xb0ea19ac6a8b59dbd895712f9d00d9d37e6deac"/>
-    <w:p>
-      <w:pPr>
-        <w:pStyle w:val="Heading2"/>
-      </w:pPr>
-      <w:r>
-        <w:t xml:space="preserve">Module 4: Impact beyond the scientific community (2)</w:t>
-      </w:r>
-    </w:p>
-    <w:p>
-      <w:pPr>
-        <w:pStyle w:val="FirstParagraph"/>
-      </w:pPr>
-      <w:r>
-        <w:rPr>
-          <w:bCs/>
-          <w:b/>
-        </w:rPr>
         <w:t xml:space="preserve">9. Orel E.</w:t>
       </w:r>
       <w:r>
@@ -3114,40 +2449,7 @@
     </w:p>
     <w:p>
       <w:pPr>
-        <w:pStyle w:val="BlockText"/>
-      </w:pPr>
-      <w:r>
-        <w:rPr>
-          <w:iCs/>
-          <w:i/>
-        </w:rPr>
-        <w:t xml:space="preserve">Contribution:</w:t>
-      </w:r>
-      <w:r>
-        <w:t xml:space="preserve"> </w:t>
-      </w:r>
-      <w:r>
-        <w:t xml:space="preserve">Designed and built the dashboard (R Markdown) used for regional situational</w:t>
-      </w:r>
-      <w:r>
-        <w:t xml:space="preserve"> </w:t>
-      </w:r>
-      <w:r>
-        <w:t xml:space="preserve">awareness across the WHO African Region during the pandemic.</w:t>
-      </w:r>
-      <w:r>
-        <w:t xml:space="preserve"> </w:t>
-      </w:r>
-      <w:r>
-        <w:rPr>
-          <w:rStyle w:val="VerbatimChar"/>
-        </w:rPr>
-        <w:t xml:space="preserve">[[If a URL, report or archived version exists, cite it - an output a reviewer cannot see is hard to credit.]]</w:t>
-      </w:r>
-    </w:p>
-    <w:p>
-      <w:pPr>
-        <w:pStyle w:val="FirstParagraph"/>
+        <w:pStyle w:val="BodyText"/>
       </w:pPr>
       <w:r>
         <w:rPr>
@@ -3178,52 +2480,7 @@
         <w:t xml:space="preserve"> </w:t>
       </w:r>
       <w:r>
-        <w:t xml:space="preserve">cantonale d'éthique de la recherche, Geneva, 2026.</w:t>
-      </w:r>
-    </w:p>
-    <w:p>
-      <w:pPr>
-        <w:pStyle w:val="BlockText"/>
-      </w:pPr>
-      <w:r>
-        <w:rPr>
-          <w:iCs/>
-          <w:i/>
-        </w:rPr>
-        <w:t xml:space="preserve">Contribution:</w:t>
-      </w:r>
-      <w:r>
-        <w:t xml:space="preserve"> </w:t>
-      </w:r>
-      <w:r>
-        <w:t xml:space="preserve">Designed and built the linkage between the cantonal legionellosis case registry</w:t>
-      </w:r>
-      <w:r>
-        <w:t xml:space="preserve"> </w:t>
-      </w:r>
-      <w:r>
-        <w:t xml:space="preserve">and individual hot water installation records - a dataset with no equivalent elsewhere - and</w:t>
-      </w:r>
-      <w:r>
-        <w:t xml:space="preserve"> </w:t>
-      </w:r>
-      <w:r>
-        <w:t xml:space="preserve">secured funding from Services Industriels de Genève, the Office cantonal de l'énergie and the</w:t>
-      </w:r>
-      <w:r>
-        <w:t xml:space="preserve"> </w:t>
-      </w:r>
-      <w:r>
-        <w:t xml:space="preserve">Service du Médecin Cantonal.</w:t>
-      </w:r>
-      <w:r>
-        <w:t xml:space="preserve"> </w:t>
-      </w:r>
-      <w:r>
-        <w:rPr>
-          <w:rStyle w:val="VerbatimChar"/>
-        </w:rPr>
-        <w:t xml:space="preserve">[[~CHF 90,000 - confirm.]]</w:t>
+        <w:t xml:space="preserve">cantonale d’éthique de la recherche, Geneva, 2026.</w:t>
       </w:r>
     </w:p>
     <w:p>
@@ -3233,8 +2490,8 @@
         </w:pict>
       </w:r>
     </w:p>
-    <w:bookmarkEnd w:id="34"/>
-    <w:bookmarkStart w:id="35" w:name="notes-on-what-was-left-out-and-why"/>
+    <w:bookmarkEnd w:id="32"/>
+    <w:bookmarkStart w:id="33" w:name="notes-on-what-was-left-out-and-why"/>
     <w:p>
       <w:pPr>
         <w:pStyle w:val="Heading2"/>
@@ -3458,6 +2715,30 @@
       </w:r>
       <w:r>
         <w:t xml:space="preserve">for prediction and evidence synthesis, applied to public health problems, increasingly led by me</w:t>
+      </w:r>
+      <w:r>
+        <w:t xml:space="preserve"> </w:t>
+      </w:r>
+      <w:r>
+        <w:t xml:space="preserve">- rather than sampling the record evenly. A narrative CV rewards judgement about your own work,</w:t>
+      </w:r>
+      <w:r>
+        <w:t xml:space="preserve"> </w:t>
+      </w:r>
+      <w:r>
+        <w:t xml:space="preserve">and a list that showed everything would show no judgement at all.</w:t>
+      </w:r>
+    </w:p>
+    <w:p>
+      <w:pPr>
+        <w:pStyle w:val="BodyText"/>
+      </w:pPr>
+      <w:r>
+        <w:rPr>
+          <w:bCs/>
+          <w:b/>
+        </w:rPr>
+        <w:t xml:space="preserve">Two decisions worth revisiting before you submit:</w:t>
       </w:r>
     </w:p>
     <w:p>
@@ -3469,32 +2750,48 @@
         <w:pStyle w:val="Compact"/>
       </w:pPr>
       <w:r>
-        <w:t xml:space="preserve">rather than sampling the record evenly. A narrative CV rewards judgement about your own work,</w:t>
-      </w:r>
-      <w:r>
-        <w:t xml:space="preserve"> </w:t>
-      </w:r>
-      <w:r>
-        <w:t xml:space="preserve">and a list that showed everything would show no judgement at all.</w:t>
-      </w:r>
-    </w:p>
-    <w:p>
-      <w:pPr>
-        <w:pStyle w:val="FirstParagraph"/>
-      </w:pPr>
-      <w:r>
-        <w:rPr>
-          <w:bCs/>
-          <w:b/>
-        </w:rPr>
-        <w:t xml:space="preserve">Two decisions worth revisiting before you submit:</w:t>
+        <w:rPr>
+          <w:bCs/>
+          <w:b/>
+        </w:rPr>
+        <w:t xml:space="preserve">Item 2 (the platform) occupies a slot that could hold a peer-reviewed paper.</w:t>
+      </w:r>
+      <w:r>
+        <w:t xml:space="preserve"> </w:t>
+      </w:r>
+      <w:r>
+        <w:t xml:space="preserve">I think it</w:t>
+      </w:r>
+      <w:r>
+        <w:t xml:space="preserve"> </w:t>
+      </w:r>
+      <w:r>
+        <w:t xml:space="preserve">earns its place: it is the instrument the whole proposal rests on, it is unambiguously yours,</w:t>
+      </w:r>
+      <w:r>
+        <w:t xml:space="preserve"> </w:t>
+      </w:r>
+      <w:r>
+        <w:t xml:space="preserve">and it is the strongest available evidence that the project is feasible. But it is the entry a</w:t>
+      </w:r>
+      <w:r>
+        <w:t xml:space="preserve"> </w:t>
+      </w:r>
+      <w:r>
+        <w:t xml:space="preserve">conservative reviewer is most likely to discount, and a Zenodo DOI would substantially reduce</w:t>
+      </w:r>
+      <w:r>
+        <w:t xml:space="preserve"> </w:t>
+      </w:r>
+      <w:r>
+        <w:t xml:space="preserve">that risk.</w:t>
       </w:r>
     </w:p>
     <w:p>
       <w:pPr>
         <w:numPr>
           <w:ilvl w:val="0"/>
-          <w:numId w:val="1002"/>
+          <w:numId w:val="1001"/>
         </w:numPr>
         <w:pStyle w:val="Compact"/>
       </w:pPr>
@@ -3503,53 +2800,7 @@
           <w:bCs/>
           <w:b/>
         </w:rPr>
-        <w:t xml:space="preserve">Item 2 (the platform) occupies a slot that could hold a peer-reviewed paper.</w:t>
-      </w:r>
-      <w:r>
-        <w:t xml:space="preserve"> </w:t>
-      </w:r>
-      <w:r>
-        <w:t xml:space="preserve">I think it</w:t>
-      </w:r>
-      <w:r>
-        <w:t xml:space="preserve"> </w:t>
-      </w:r>
-      <w:r>
-        <w:t xml:space="preserve">earns its place: it is the instrument the whole proposal rests on, it is unambiguously yours,</w:t>
-      </w:r>
-      <w:r>
-        <w:t xml:space="preserve"> </w:t>
-      </w:r>
-      <w:r>
-        <w:t xml:space="preserve">and it is the strongest available evidence that the project is feasible. But it is the entry a</w:t>
-      </w:r>
-      <w:r>
-        <w:t xml:space="preserve"> </w:t>
-      </w:r>
-      <w:r>
-        <w:t xml:space="preserve">conservative reviewer is most likely to discount, and a Zenodo DOI would substantially reduce</w:t>
-      </w:r>
-      <w:r>
-        <w:t xml:space="preserve"> </w:t>
-      </w:r>
-      <w:r>
-        <w:t xml:space="preserve">that risk.</w:t>
-      </w:r>
-    </w:p>
-    <w:p>
-      <w:pPr>
-        <w:numPr>
-          <w:ilvl w:val="0"/>
-          <w:numId w:val="1002"/>
-        </w:numPr>
-        <w:pStyle w:val="Compact"/>
-      </w:pPr>
-      <w:r>
-        <w:rPr>
-          <w:bCs/>
-          <w:b/>
-        </w:rPr>
-        <w:t xml:space="preserve">The Ng'ambi CVD paper (item 5) is accepted for publication</w:t>
+        <w:t xml:space="preserve">The Ng’ambi CVD paper (item 5) is accepted for publication</w:t>
       </w:r>
       <w:r>
         <w:t xml:space="preserve"> </w:t>
@@ -3570,9 +2821,11 @@
         <w:t xml:space="preserve">Update venue, year and DOI when they are assigned.</w:t>
       </w:r>
     </w:p>
-    <w:bookmarkEnd w:id="35"/>
-    <w:bookmarkEnd w:id="36"/>
-    <w:sectPr/>
+    <w:bookmarkEnd w:id="33"/>
+    <w:sectPr>
+      <w:pgSz w:h="16838" w:w="11906"/>
+      <w:pgMar w:top="1000" w:right="1134" w:bottom="900" w:left="1134" w:header="708" w:footer="708" w:gutter="0"/>
+    </w:sectPr>
   </w:body>
 </w:document>
 </file>
@@ -3760,9 +3013,6 @@
   <w:num w:numId="1001">
     <w:abstractNumId w:val="991"/>
   </w:num>
-  <w:num w:numId="1002">
-    <w:abstractNumId w:val="991"/>
-  </w:num>
 </w:numbering>
 </file>
 
@@ -3774,12 +3024,12 @@
         <w:rFonts w:asciiTheme="minorHAnsi" w:cstheme="minorBidi" w:eastAsiaTheme="minorHAnsi" w:hAnsiTheme="minorHAnsi"/>
         <w:sz w:val="24"/>
         <w:szCs w:val="24"/>
-        <w:lang w:bidi="ar-SA" w:eastAsia="en-US" w:val="en-US"/>
+        <w:lang w:bidi="ar-SA" w:eastAsia="en-US" w:val="fr"/>
       </w:rPr>
     </w:rPrDefault>
     <w:pPrDefault>
       <w:pPr>
-        <w:spacing w:after="200"/>
+        <w:spacing w:after="60"/>
       </w:pPr>
     </w:pPrDefault>
   </w:docDefaults>
@@ -3787,13 +3037,17 @@
   <w:style w:default="1" w:styleId="Normal" w:type="paragraph">
     <w:name w:val="Normal"/>
     <w:qFormat/>
+    <w:pPr>
+      <w:jc w:val="both"/>
+    </w:pPr>
   </w:style>
   <w:style w:styleId="BodyText" w:type="paragraph">
     <w:name w:val="Body Text"/>
     <w:basedOn w:val="Normal"/>
     <w:link w:val="BodyTextChar"/>
     <w:pPr>
-      <w:spacing w:after="180" w:before="180"/>
+      <w:spacing w:after="60" w:before="120"/>
+      <w:jc w:val="both"/>
     </w:pPr>
     <w:qFormat/>
   </w:style>
@@ -3802,6 +3056,9 @@
     <w:basedOn w:val="BodyText"/>
     <w:next w:val="BodyText"/>
     <w:qFormat/>
+    <w:pPr>
+      <w:jc w:val="both"/>
+    </w:pPr>
   </w:style>
   <w:style w:customStyle="1" w:styleId="Compact" w:type="paragraph">
     <w:name w:val="Compact"/>
@@ -3809,6 +3066,7 @@
     <w:qFormat/>
     <w:pPr>
       <w:spacing w:after="36" w:before="36"/>
+      <w:jc w:val="both"/>
     </w:pPr>
   </w:style>
   <w:style w:styleId="Title" w:type="paragraph">
@@ -3819,7 +3077,7 @@
     <w:pPr>
       <w:keepNext/>
       <w:keepLines/>
-      <w:spacing w:after="240" w:before="480"/>
+      <w:spacing w:after="60" w:before="120"/>
       <w:jc w:val="center"/>
     </w:pPr>
     <w:rPr>
@@ -3839,7 +3097,7 @@
     <w:pPr>
       <w:keepNext/>
       <w:keepLines/>
-      <w:spacing w:after="240" w:before="240"/>
+      <w:spacing w:after="60" w:before="120"/>
       <w:jc w:val="center"/>
     </w:pPr>
     <w:rPr>
@@ -3876,7 +3134,7 @@
       <w:keepNext/>
       <w:keepLines/>
       <w:jc w:val="center"/>
-      <w:spacing w:after="0" w:before="300"/>
+      <w:spacing w:after="0" w:before="120"/>
     </w:pPr>
     <w:rPr>
       <w:sz w:val="20"/>
@@ -3894,7 +3152,7 @@
     <w:pPr>
       <w:keepNext/>
       <w:keepLines/>
-      <w:spacing w:after="300" w:before="100"/>
+      <w:spacing w:after="60" w:before="100"/>
     </w:pPr>
     <w:rPr>
       <w:sz w:val="20"/>
@@ -3918,7 +3176,7 @@
     <w:pPr>
       <w:keepNext/>
       <w:keepLines/>
-      <w:spacing w:after="0" w:before="480"/>
+      <w:spacing w:after="0" w:before="120"/>
       <w:outlineLvl w:val="0"/>
     </w:pPr>
     <w:rPr>
@@ -3940,7 +3198,7 @@
     <w:pPr>
       <w:keepNext/>
       <w:keepLines/>
-      <w:spacing w:after="0" w:before="200"/>
+      <w:spacing w:after="0" w:before="120"/>
       <w:outlineLvl w:val="1"/>
     </w:pPr>
     <w:rPr>
@@ -3962,7 +3220,7 @@
     <w:pPr>
       <w:keepNext/>
       <w:keepLines/>
-      <w:spacing w:after="0" w:before="200"/>
+      <w:spacing w:after="0" w:before="120"/>
       <w:outlineLvl w:val="2"/>
     </w:pPr>
     <w:rPr>
@@ -3984,7 +3242,7 @@
     <w:pPr>
       <w:keepNext/>
       <w:keepLines/>
-      <w:spacing w:after="0" w:before="200"/>
+      <w:spacing w:after="0" w:before="120"/>
       <w:outlineLvl w:val="3"/>
     </w:pPr>
     <w:rPr>
@@ -4006,7 +3264,7 @@
     <w:pPr>
       <w:keepNext/>
       <w:keepLines/>
-      <w:spacing w:after="0" w:before="200"/>
+      <w:spacing w:after="0" w:before="120"/>
       <w:outlineLvl w:val="4"/>
     </w:pPr>
     <w:rPr>
@@ -4027,7 +3285,7 @@
     <w:pPr>
       <w:keepNext/>
       <w:keepLines/>
-      <w:spacing w:after="0" w:before="200"/>
+      <w:spacing w:after="0" w:before="120"/>
       <w:outlineLvl w:val="5"/>
     </w:pPr>
     <w:rPr>
@@ -4047,7 +3305,7 @@
     <w:pPr>
       <w:keepNext/>
       <w:keepLines/>
-      <w:spacing w:after="0" w:before="200"/>
+      <w:spacing w:after="0" w:before="120"/>
       <w:outlineLvl w:val="6"/>
     </w:pPr>
     <w:rPr>
@@ -4067,7 +3325,7 @@
     <w:pPr>
       <w:keepNext/>
       <w:keepLines/>
-      <w:spacing w:after="0" w:before="200"/>
+      <w:spacing w:after="0" w:before="120"/>
       <w:outlineLvl w:val="7"/>
     </w:pPr>
     <w:rPr>
@@ -4087,7 +3345,7 @@
     <w:pPr>
       <w:keepNext/>
       <w:keepLines/>
-      <w:spacing w:after="0" w:before="200"/>
+      <w:spacing w:after="0" w:before="120"/>
       <w:outlineLvl w:val="8"/>
     </w:pPr>
     <w:rPr>
@@ -4105,7 +3363,7 @@
     <w:unhideWhenUsed/>
     <w:qFormat/>
     <w:pPr>
-      <w:spacing w:after="100" w:before="100"/>
+      <w:spacing w:after="60" w:before="100"/>
       <w:ind w:firstLine="0" w:left="480" w:right="480"/>
     </w:pPr>
   </w:style>
@@ -4175,7 +3433,7 @@
     <w:basedOn w:val="Normal"/>
     <w:link w:val="BodyTextChar"/>
     <w:pPr>
-      <w:spacing w:after="120" w:before="0"/>
+      <w:spacing w:after="60" w:before="0"/>
     </w:pPr>
     <w:rPr>
       <w:i/>
@@ -4242,7 +3500,7 @@
     <w:unhideWhenUsed/>
     <w:qFormat/>
     <w:pPr>
-      <w:spacing w:before="240" w:line="259" w:lineRule="auto"/>
+      <w:spacing w:before="120" w:line="259" w:lineRule="auto"/>
       <w:outlineLvl w:val="9"/>
     </w:pPr>
     <w:rPr>
@@ -4252,7 +3510,7 @@
       <w:color w:themeColor="accent1" w:themeShade="BF" w:val="365F91"/>
     </w:rPr>
   </w:style>
-  <w:style w:type="paragraph" w:customStyle="1" w:styleId="SourceCode">
+  <w:style w:customStyle="1" w:styleId="SourceCode" w:type="paragraph">
     <w:name w:val="Source Code"/>
     <w:basedOn w:val="Normal"/>
     <w:link w:val="VerbatimChar"/>
@@ -4260,7 +3518,7 @@
       <w:wordWrap w:val="off"/>
     </w:pPr>
   </w:style>
-  <w:style w:type="character" w:customStyle="1" w:styleId="KeywordTok">
+  <w:style w:customStyle="1" w:styleId="KeywordTok" w:type="character">
     <w:name w:val="KeywordTok"/>
     <w:basedOn w:val="VerbatimChar"/>
     <w:rPr>
@@ -4268,77 +3526,77 @@
       <w:b/>
     </w:rPr>
   </w:style>
-  <w:style w:type="character" w:customStyle="1" w:styleId="DataTypeTok">
+  <w:style w:customStyle="1" w:styleId="DataTypeTok" w:type="character">
     <w:name w:val="DataTypeTok"/>
     <w:basedOn w:val="VerbatimChar"/>
     <w:rPr>
       <w:color w:val="902000"/>
     </w:rPr>
   </w:style>
-  <w:style w:type="character" w:customStyle="1" w:styleId="DecValTok">
+  <w:style w:customStyle="1" w:styleId="DecValTok" w:type="character">
     <w:name w:val="DecValTok"/>
     <w:basedOn w:val="VerbatimChar"/>
     <w:rPr>
       <w:color w:val="40a070"/>
     </w:rPr>
   </w:style>
-  <w:style w:type="character" w:customStyle="1" w:styleId="BaseNTok">
+  <w:style w:customStyle="1" w:styleId="BaseNTok" w:type="character">
     <w:name w:val="BaseNTok"/>
     <w:basedOn w:val="VerbatimChar"/>
     <w:rPr>
       <w:color w:val="40a070"/>
     </w:rPr>
   </w:style>
-  <w:style w:type="character" w:customStyle="1" w:styleId="FloatTok">
+  <w:style w:customStyle="1" w:styleId="FloatTok" w:type="character">
     <w:name w:val="FloatTok"/>
     <w:basedOn w:val="VerbatimChar"/>
     <w:rPr>
       <w:color w:val="40a070"/>
     </w:rPr>
   </w:style>
-  <w:style w:type="character" w:customStyle="1" w:styleId="ConstantTok">
+  <w:style w:customStyle="1" w:styleId="ConstantTok" w:type="character">
     <w:name w:val="ConstantTok"/>
     <w:basedOn w:val="VerbatimChar"/>
     <w:rPr>
       <w:color w:val="880000"/>
     </w:rPr>
   </w:style>
-  <w:style w:type="character" w:customStyle="1" w:styleId="CharTok">
+  <w:style w:customStyle="1" w:styleId="CharTok" w:type="character">
     <w:name w:val="CharTok"/>
     <w:basedOn w:val="VerbatimChar"/>
     <w:rPr>
       <w:color w:val="4070a0"/>
     </w:rPr>
   </w:style>
-  <w:style w:type="character" w:customStyle="1" w:styleId="SpecialCharTok">
+  <w:style w:customStyle="1" w:styleId="SpecialCharTok" w:type="character">
     <w:name w:val="SpecialCharTok"/>
     <w:basedOn w:val="VerbatimChar"/>
     <w:rPr>
       <w:color w:val="4070a0"/>
     </w:rPr>
   </w:style>
-  <w:style w:type="character" w:customStyle="1" w:styleId="StringTok">
+  <w:style w:customStyle="1" w:styleId="StringTok" w:type="character">
     <w:name w:val="StringTok"/>
     <w:basedOn w:val="VerbatimChar"/>
     <w:rPr>
       <w:color w:val="4070a0"/>
     </w:rPr>
   </w:style>
-  <w:style w:type="character" w:customStyle="1" w:styleId="VerbatimStringTok">
+  <w:style w:customStyle="1" w:styleId="VerbatimStringTok" w:type="character">
     <w:name w:val="VerbatimStringTok"/>
     <w:basedOn w:val="VerbatimChar"/>
     <w:rPr>
       <w:color w:val="4070a0"/>
     </w:rPr>
   </w:style>
-  <w:style w:type="character" w:customStyle="1" w:styleId="SpecialStringTok">
+  <w:style w:customStyle="1" w:styleId="SpecialStringTok" w:type="character">
     <w:name w:val="SpecialStringTok"/>
     <w:basedOn w:val="VerbatimChar"/>
     <w:rPr>
       <w:color w:val="bb6688"/>
     </w:rPr>
   </w:style>
-  <w:style w:type="character" w:customStyle="1" w:styleId="ImportTok">
+  <w:style w:customStyle="1" w:styleId="ImportTok" w:type="character">
     <w:name w:val="ImportTok"/>
     <w:basedOn w:val="VerbatimChar"/>
     <w:rPr>
@@ -4346,7 +3604,7 @@
       <w:b/>
     </w:rPr>
   </w:style>
-  <w:style w:type="character" w:customStyle="1" w:styleId="CommentTok">
+  <w:style w:customStyle="1" w:styleId="CommentTok" w:type="character">
     <w:name w:val="CommentTok"/>
     <w:basedOn w:val="VerbatimChar"/>
     <w:rPr>
@@ -4354,7 +3612,7 @@
       <w:i/>
     </w:rPr>
   </w:style>
-  <w:style w:type="character" w:customStyle="1" w:styleId="DocumentationTok">
+  <w:style w:customStyle="1" w:styleId="DocumentationTok" w:type="character">
     <w:name w:val="DocumentationTok"/>
     <w:basedOn w:val="VerbatimChar"/>
     <w:rPr>
@@ -4362,7 +3620,7 @@
       <w:i/>
     </w:rPr>
   </w:style>
-  <w:style w:type="character" w:customStyle="1" w:styleId="AnnotationTok">
+  <w:style w:customStyle="1" w:styleId="AnnotationTok" w:type="character">
     <w:name w:val="AnnotationTok"/>
     <w:basedOn w:val="VerbatimChar"/>
     <w:rPr>
@@ -4371,7 +3629,7 @@
       <w:i/>
     </w:rPr>
   </w:style>
-  <w:style w:type="character" w:customStyle="1" w:styleId="CommentVarTok">
+  <w:style w:customStyle="1" w:styleId="CommentVarTok" w:type="character">
     <w:name w:val="CommentVarTok"/>
     <w:basedOn w:val="VerbatimChar"/>
     <w:rPr>
@@ -4380,28 +3638,28 @@
       <w:i/>
     </w:rPr>
   </w:style>
-  <w:style w:type="character" w:customStyle="1" w:styleId="OtherTok">
+  <w:style w:customStyle="1" w:styleId="OtherTok" w:type="character">
     <w:name w:val="OtherTok"/>
     <w:basedOn w:val="VerbatimChar"/>
     <w:rPr>
       <w:color w:val="007020"/>
     </w:rPr>
   </w:style>
-  <w:style w:type="character" w:customStyle="1" w:styleId="FunctionTok">
+  <w:style w:customStyle="1" w:styleId="FunctionTok" w:type="character">
     <w:name w:val="FunctionTok"/>
     <w:basedOn w:val="VerbatimChar"/>
     <w:rPr>
       <w:color w:val="06287e"/>
     </w:rPr>
   </w:style>
-  <w:style w:type="character" w:customStyle="1" w:styleId="VariableTok">
+  <w:style w:customStyle="1" w:styleId="VariableTok" w:type="character">
     <w:name w:val="VariableTok"/>
     <w:basedOn w:val="VerbatimChar"/>
     <w:rPr>
       <w:color w:val="19177c"/>
     </w:rPr>
   </w:style>
-  <w:style w:type="character" w:customStyle="1" w:styleId="ControlFlowTok">
+  <w:style w:customStyle="1" w:styleId="ControlFlowTok" w:type="character">
     <w:name w:val="ControlFlowTok"/>
     <w:basedOn w:val="VerbatimChar"/>
     <w:rPr>
@@ -4409,45 +3667,45 @@
       <w:b/>
     </w:rPr>
   </w:style>
-  <w:style w:type="character" w:customStyle="1" w:styleId="OperatorTok">
+  <w:style w:customStyle="1" w:styleId="OperatorTok" w:type="character">
     <w:name w:val="OperatorTok"/>
     <w:basedOn w:val="VerbatimChar"/>
     <w:rPr>
       <w:color w:val="666666"/>
     </w:rPr>
   </w:style>
-  <w:style w:type="character" w:customStyle="1" w:styleId="BuiltInTok">
+  <w:style w:customStyle="1" w:styleId="BuiltInTok" w:type="character">
     <w:name w:val="BuiltInTok"/>
     <w:basedOn w:val="VerbatimChar"/>
     <w:rPr>
       <w:color w:val="008000"/>
     </w:rPr>
   </w:style>
-  <w:style w:type="character" w:customStyle="1" w:styleId="ExtensionTok">
+  <w:style w:customStyle="1" w:styleId="ExtensionTok" w:type="character">
     <w:name w:val="ExtensionTok"/>
     <w:basedOn w:val="VerbatimChar"/>
     <w:rPr/>
   </w:style>
-  <w:style w:type="character" w:customStyle="1" w:styleId="PreprocessorTok">
+  <w:style w:customStyle="1" w:styleId="PreprocessorTok" w:type="character">
     <w:name w:val="PreprocessorTok"/>
     <w:basedOn w:val="VerbatimChar"/>
     <w:rPr>
       <w:color w:val="bc7a00"/>
     </w:rPr>
   </w:style>
-  <w:style w:type="character" w:customStyle="1" w:styleId="AttributeTok">
+  <w:style w:customStyle="1" w:styleId="AttributeTok" w:type="character">
     <w:name w:val="AttributeTok"/>
     <w:basedOn w:val="VerbatimChar"/>
     <w:rPr>
       <w:color w:val="7d9029"/>
     </w:rPr>
   </w:style>
-  <w:style w:type="character" w:customStyle="1" w:styleId="RegionMarkerTok">
+  <w:style w:customStyle="1" w:styleId="RegionMarkerTok" w:type="character">
     <w:name w:val="RegionMarkerTok"/>
     <w:basedOn w:val="VerbatimChar"/>
     <w:rPr/>
   </w:style>
-  <w:style w:type="character" w:customStyle="1" w:styleId="InformationTok">
+  <w:style w:customStyle="1" w:styleId="InformationTok" w:type="character">
     <w:name w:val="InformationTok"/>
     <w:basedOn w:val="VerbatimChar"/>
     <w:rPr>
@@ -4456,7 +3714,7 @@
       <w:i/>
     </w:rPr>
   </w:style>
-  <w:style w:type="character" w:customStyle="1" w:styleId="WarningTok">
+  <w:style w:customStyle="1" w:styleId="WarningTok" w:type="character">
     <w:name w:val="WarningTok"/>
     <w:basedOn w:val="VerbatimChar"/>
     <w:rPr>
@@ -4465,7 +3723,7 @@
       <w:i/>
     </w:rPr>
   </w:style>
-  <w:style w:type="character" w:customStyle="1" w:styleId="AlertTok">
+  <w:style w:customStyle="1" w:styleId="AlertTok" w:type="character">
     <w:name w:val="AlertTok"/>
     <w:basedOn w:val="VerbatimChar"/>
     <w:rPr>
@@ -4473,7 +3731,7 @@
       <w:b/>
     </w:rPr>
   </w:style>
-  <w:style w:type="character" w:customStyle="1" w:styleId="ErrorTok">
+  <w:style w:customStyle="1" w:styleId="ErrorTok" w:type="character">
     <w:name w:val="ErrorTok"/>
     <w:basedOn w:val="VerbatimChar"/>
     <w:rPr>
@@ -4481,7 +3739,7 @@
       <w:b/>
     </w:rPr>
   </w:style>
-  <w:style w:type="character" w:customStyle="1" w:styleId="NormalTok">
+  <w:style w:customStyle="1" w:styleId="NormalTok" w:type="character">
     <w:name w:val="NormalTok"/>
     <w:basedOn w:val="VerbatimChar"/>
     <w:rPr/>

</xml_diff>

<commit_message>
CV output list: LiteRev funding incl. the Fondation Ernst et Lucie Schmidheiny; CV docx/pdf rebuilt
Co-Authored-By: Claude Fable 5.1 <noreply@anthropic.com>
Claude-Session: https://claude.ai/code/session_01Pijyy83JyS8bJxoVQgxwZB
</commit_message>
<xml_diff>
--- a/04-other-documents/cv-snsf-draft.docx
+++ b/04-other-documents/cv-snsf-draft.docx
@@ -2,45 +2,53 @@
 <file path=word/document.xml><?xml version="1.0" encoding="utf-8"?>
 <w:document xmlns:w="http://schemas.openxmlformats.org/wordprocessingml/2006/main" xmlns:m="http://schemas.openxmlformats.org/officeDocument/2006/math" xmlns:r="http://schemas.openxmlformats.org/officeDocument/2006/relationships" xmlns:o="urn:schemas-microsoft-com:office:office" xmlns:v="urn:schemas-microsoft-com:vml" xmlns:w10="urn:schemas-microsoft-com:office:word" xmlns:a="http://schemas.openxmlformats.org/drawingml/2006/main" xmlns:pic="http://schemas.openxmlformats.org/drawingml/2006/picture" xmlns:wp="http://schemas.openxmlformats.org/drawingml/2006/wordprocessingDrawing">
   <w:body>
+    <w:bookmarkStart w:id="26" w:name="Xa8406471446f014a74a859a1f62a31a58377ea4"/>
+    <w:p>
+      <w:pPr>
+        <w:pStyle w:val="Heading1"/>
+      </w:pPr>
+      <w:r>
+        <w:t xml:space="preserve">CV in SNSF format: draft for the RGO form (upload 2) and the portal</w:t>
+      </w:r>
+    </w:p>
+    <w:bookmarkStart w:id="21" w:name="personal-data"/>
+    <w:p>
+      <w:pPr>
+        <w:pStyle w:val="Heading2"/>
+      </w:pPr>
+      <w:r>
+        <w:t xml:space="preserve">Personal data</w:t>
+      </w:r>
+    </w:p>
     <w:p>
       <w:pPr>
         <w:pStyle w:val="FirstParagraph"/>
       </w:pPr>
       <w:r>
-        <w:rPr>
-          <w:bCs/>
-          <w:b/>
-        </w:rPr>
-        <w:t xml:space="preserve">Curriculum Vitae - Erol Orel</w:t>
-      </w:r>
-      <w:r>
-        <w:t xml:space="preserve"> </w:t>
-      </w:r>
-      <w:r>
-        <w:t xml:space="preserve">(SNSF format; content to transfer to the portal)</w:t>
-      </w:r>
-    </w:p>
-    <w:bookmarkStart w:id="20" w:name="personal-data"/>
-    <w:p>
-      <w:pPr>
-        <w:pStyle w:val="Heading2"/>
-      </w:pPr>
-      <w:r>
-        <w:t xml:space="preserve">Personal data</w:t>
-      </w:r>
-    </w:p>
-    <w:p>
-      <w:pPr>
-        <w:pStyle w:val="FirstParagraph"/>
-      </w:pPr>
-      <w:r>
         <w:t xml:space="preserve">Erol Orel, PhD, FRM · Senior Research Associate, Institute of Global Health, Faculty of</w:t>
       </w:r>
       <w:r>
         <w:t xml:space="preserve"> </w:t>
       </w:r>
       <w:r>
-        <w:t xml:space="preserve">Medicine, University of Geneva · Erol.Orel@unige.ch · +41 79 795 83 19 ·</w:t>
+        <w:t xml:space="preserve">Medicine, University of Geneva ·</w:t>
+      </w:r>
+      <w:r>
+        <w:t xml:space="preserve"> </w:t>
+      </w:r>
+      <w:hyperlink r:id="rId20">
+        <w:r>
+          <w:rPr>
+            <w:rStyle w:val="Hyperlink"/>
+          </w:rPr>
+          <w:t xml:space="preserve">Erol.Orel@unige.ch</w:t>
+        </w:r>
+      </w:hyperlink>
+      <w:r>
+        <w:t xml:space="preserve"> </w:t>
+      </w:r>
+      <w:r>
+        <w:t xml:space="preserve">· +41 79 795 83 19 ·</w:t>
       </w:r>
       <w:r>
         <w:t xml:space="preserve"> </w:t>
@@ -58,8 +66,8 @@
         <w:t xml:space="preserve">[[check/refresh the public ORCID record this week]]</w:t>
       </w:r>
     </w:p>
-    <w:bookmarkEnd w:id="20"/>
-    <w:bookmarkStart w:id="21" w:name="education"/>
+    <w:bookmarkEnd w:id="21"/>
+    <w:bookmarkStart w:id="22" w:name="education"/>
     <w:p>
       <w:pPr>
         <w:pStyle w:val="Heading2"/>
@@ -71,7 +79,7 @@
     <w:tbl>
       <w:tblPr>
         <w:tblStyle w:val="Table"/>
-        <w:tblW w:type="pct" w:w="5000"/>
+        <w:tblW w:type="auto" w:w="0"/>
         <w:tblLook w:firstRow="1" w:lastRow="0" w:firstColumn="0" w:lastColumn="0" w:noHBand="0" w:noVBand="0" w:val="0020"/>
         <w:jc w:val="start"/>
       </w:tblPr>
@@ -129,19 +137,7 @@
               <w:jc w:val="left"/>
             </w:pPr>
             <w:r>
-              <w:t xml:space="preserve">PhD in Biomedical Sciences, Global Health track, Faculty of Medicine, University of Geneva. Defended 18 December 2023. Dissertation:</w:t>
-            </w:r>
-            <w:r>
-              <w:t xml:space="preserve"> </w:t>
-            </w:r>
-            <w:r>
-              <w:t xml:space="preserve">“</w:t>
-            </w:r>
-            <w:r>
-              <w:t xml:space="preserve">Enhancing HIV Prediction through Machine Learning and Streamlining Research with LiteRev</w:t>
-            </w:r>
-            <w:r>
-              <w:t xml:space="preserve">”</w:t>
+              <w:t xml:space="preserve">PhD in Biomedical Sciences, Global Health track, Faculty of Medicine, University of Geneva. Defended 18 December 2023. Dissertation: "Enhancing HIV Prediction through Machine Learning and Streamlining Research with LiteRev"</w:t>
             </w:r>
           </w:p>
         </w:tc>
@@ -219,25 +215,7 @@
               <w:jc w:val="left"/>
             </w:pPr>
             <w:r>
-              <w:t xml:space="preserve">Master of Advanced Studies (DEA) in Econometrics, University of Geneva. Dissertation:</w:t>
-            </w:r>
-            <w:r>
-              <w:t xml:space="preserve"> </w:t>
-            </w:r>
-            <w:r>
-              <w:t xml:space="preserve">“</w:t>
-            </w:r>
-            <w:r>
-              <w:t xml:space="preserve">Additive Models and Local Kernel M-Estimator: Bandwidth Selection and Application to the Implied Volatility Surface</w:t>
-            </w:r>
-            <w:r>
-              <w:t xml:space="preserve">”</w:t>
-            </w:r>
-            <w:r>
-              <w:t xml:space="preserve"> </w:t>
-            </w:r>
-            <w:r>
-              <w:t xml:space="preserve">(supervised by Prof. Eva Cantoni)</w:t>
+              <w:t xml:space="preserve">Master of Advanced Studies (DEA) in Econometrics, University of Geneva. Dissertation: "Additive Models and Local Kernel M-Estimator: Bandwidth Selection and Application to the Implied Volatility Surface" (supervised by Prof. Eva Cantoni)</w:t>
             </w:r>
           </w:p>
         </w:tc>
@@ -269,8 +247,8 @@
         </w:tc>
       </w:tr>
     </w:tbl>
-    <w:bookmarkEnd w:id="21"/>
-    <w:bookmarkStart w:id="22" w:name="positions-held"/>
+    <w:bookmarkEnd w:id="22"/>
+    <w:bookmarkStart w:id="23" w:name="positions-held"/>
     <w:p>
       <w:pPr>
         <w:pStyle w:val="Heading2"/>
@@ -282,7 +260,7 @@
     <w:tbl>
       <w:tblPr>
         <w:tblStyle w:val="Table"/>
-        <w:tblW w:type="pct" w:w="5000"/>
+        <w:tblW w:type="auto" w:w="0"/>
         <w:tblLook w:firstRow="1" w:lastRow="0" w:firstColumn="0" w:lastColumn="0" w:noHBand="0" w:noVBand="0" w:val="0020"/>
         <w:jc w:val="start"/>
       </w:tblPr>
@@ -467,8 +445,8 @@
         <w:t xml:space="preserve">[[none to declare, or state them; the SNSF assesses output relative to academic age - PhD December 2023, so about three years]]</w:t>
       </w:r>
     </w:p>
-    <w:bookmarkEnd w:id="22"/>
-    <w:bookmarkStart w:id="23" w:name="languages"/>
+    <w:bookmarkEnd w:id="23"/>
+    <w:bookmarkStart w:id="24" w:name="languages"/>
     <w:p>
       <w:pPr>
         <w:pStyle w:val="Heading2"/>
@@ -485,14 +463,158 @@
         <w:t xml:space="preserve">French (mother tongue), English (fluent), Turkish (father tongue), German and Spanish (basic).</w:t>
       </w:r>
     </w:p>
-    <w:bookmarkEnd w:id="23"/>
-    <w:bookmarkStart w:id="24" w:name="X42081ee612172b9b390e30b1acc715b33e1fdff"/>
+    <w:bookmarkEnd w:id="24"/>
+    <w:bookmarkStart w:id="25" w:name="X312d1cbbd0f726d8a564803d6fa7fd37aced747"/>
     <w:p>
       <w:pPr>
         <w:pStyle w:val="Heading2"/>
       </w:pPr>
       <w:r>
-        <w:t xml:space="preserve">Module 1 - Generation of new ideas, tools, methodologies or knowledge</w:t>
+        <w:t xml:space="preserve">The four narrative modules and the ten outputs</w:t>
+      </w:r>
+    </w:p>
+    <w:p>
+      <w:pPr>
+        <w:pStyle w:val="FirstParagraph"/>
+      </w:pPr>
+      <w:r>
+        <w:t xml:space="preserve">The module texts are drafted in</w:t>
+      </w:r>
+      <w:r>
+        <w:t xml:space="preserve"> </w:t>
+      </w:r>
+      <w:r>
+        <w:rPr>
+          <w:rStyle w:val="VerbatimChar"/>
+        </w:rPr>
+        <w:t xml:space="preserve">cv-narratives/module-1-knowledge.md</w:t>
+      </w:r>
+      <w:r>
+        <w:t xml:space="preserve"> </w:t>
+      </w:r>
+      <w:r>
+        <w:t xml:space="preserve">(4 outputs),</w:t>
+      </w:r>
+      <w:r>
+        <w:t xml:space="preserve"> </w:t>
+      </w:r>
+      <w:r>
+        <w:rPr>
+          <w:rStyle w:val="VerbatimChar"/>
+        </w:rPr>
+        <w:t xml:space="preserve">module-2-individuals.md</w:t>
+      </w:r>
+      <w:r>
+        <w:t xml:space="preserve"> </w:t>
+      </w:r>
+      <w:r>
+        <w:t xml:space="preserve">(2),</w:t>
+      </w:r>
+      <w:r>
+        <w:t xml:space="preserve"> </w:t>
+      </w:r>
+      <w:r>
+        <w:rPr>
+          <w:rStyle w:val="VerbatimChar"/>
+        </w:rPr>
+        <w:t xml:space="preserve">module-3-community.md</w:t>
+      </w:r>
+      <w:r>
+        <w:t xml:space="preserve"> </w:t>
+      </w:r>
+      <w:r>
+        <w:t xml:space="preserve">(2),</w:t>
+      </w:r>
+      <w:r>
+        <w:t xml:space="preserve"> </w:t>
+      </w:r>
+      <w:r>
+        <w:rPr>
+          <w:rStyle w:val="VerbatimChar"/>
+        </w:rPr>
+        <w:t xml:space="preserve">module-4-society.md</w:t>
+      </w:r>
+      <w:r>
+        <w:t xml:space="preserve"> </w:t>
+      </w:r>
+      <w:r>
+        <w:t xml:space="preserve">(2);</w:t>
+      </w:r>
+      <w:r>
+        <w:t xml:space="preserve"> </w:t>
+      </w:r>
+      <w:r>
+        <w:t xml:space="preserve">the output list with contribution statements is</w:t>
+      </w:r>
+      <w:r>
+        <w:t xml:space="preserve"> </w:t>
+      </w:r>
+      <w:r>
+        <w:rPr>
+          <w:rStyle w:val="VerbatimChar"/>
+        </w:rPr>
+        <w:t xml:space="preserve">cv-narratives/research-output-list.md</w:t>
+      </w:r>
+      <w:r>
+        <w:t xml:space="preserve">.</w:t>
+      </w:r>
+      <w:r>
+        <w:t xml:space="preserve"> </w:t>
+      </w:r>
+      <w:r>
+        <w:t xml:space="preserve">They follow in the .docx. Before upload: answer the README's open question (any real</w:t>
+      </w:r>
+      <w:r>
+        <w:t xml:space="preserve"> </w:t>
+      </w:r>
+      <w:r>
+        <w:t xml:space="preserve">co-supervision to name in Module 2?), and check Ng'ambi reads</w:t>
+      </w:r>
+      <w:r>
+        <w:t xml:space="preserve"> </w:t>
+      </w:r>
+      <w:r>
+        <w:rPr>
+          <w:bCs/>
+          <w:b/>
+        </w:rPr>
+        <w:t xml:space="preserve">accepted</w:t>
+      </w:r>
+      <w:r>
+        <w:t xml:space="preserve"> </w:t>
+      </w:r>
+      <w:r>
+        <w:t xml:space="preserve">and the BMJ Open</w:t>
+      </w:r>
+      <w:r>
+        <w:t xml:space="preserve"> </w:t>
+      </w:r>
+      <w:r>
+        <w:t xml:space="preserve">paper</w:t>
+      </w:r>
+      <w:r>
+        <w:t xml:space="preserve"> </w:t>
+      </w:r>
+      <w:r>
+        <w:rPr>
+          <w:bCs/>
+          <w:b/>
+        </w:rPr>
+        <w:t xml:space="preserve">under review</w:t>
+      </w:r>
+      <w:r>
+        <w:t xml:space="preserve">.</w:t>
+      </w:r>
+    </w:p>
+    <w:bookmarkEnd w:id="25"/>
+    <w:bookmarkEnd w:id="26"/>
+    <w:bookmarkStart w:id="27" w:name="Xf63ed11c7c804818f56278a0fb29f5741a28837"/>
+    <w:p>
+      <w:pPr>
+        <w:pStyle w:val="Heading1"/>
+      </w:pPr>
+      <w:r>
+        <w:t xml:space="preserve">Module 1: Contributions to the generation of new ideas, tools, methodologies or knowledge</w:t>
       </w:r>
     </w:p>
     <w:p>
@@ -843,14 +965,14 @@
         <w:t xml:space="preserve">required close engagement with hospital clinical data and with the people who generate it.</w:t>
       </w:r>
     </w:p>
-    <w:bookmarkEnd w:id="24"/>
-    <w:bookmarkStart w:id="25" w:name="X7a2886d89382aa82d0efebd34bdae0927762d02"/>
-    <w:p>
-      <w:pPr>
-        <w:pStyle w:val="Heading2"/>
-      </w:pPr>
-      <w:r>
-        <w:t xml:space="preserve">Module 2 - Development of other individuals and research teams</w:t>
+    <w:bookmarkEnd w:id="27"/>
+    <w:bookmarkStart w:id="28" w:name="Xfc6d56748425c7eaaacf9212eba9d448dc722da"/>
+    <w:p>
+      <w:pPr>
+        <w:pStyle w:val="Heading1"/>
+      </w:pPr>
+      <w:r>
+        <w:t xml:space="preserve">Module 2: Contributions to the development of other individuals and research teams</w:t>
       </w:r>
     </w:p>
     <w:p>
@@ -883,7 +1005,7 @@
         <w:t xml:space="preserve"> </w:t>
       </w:r>
       <w:r>
-        <w:t xml:space="preserve">enable other people’s research.</w:t>
+        <w:t xml:space="preserve">enable other people's research.</w:t>
       </w:r>
     </w:p>
     <w:p>
@@ -913,7 +1035,7 @@
         <w:t xml:space="preserve"> </w:t>
       </w:r>
       <w:r>
-        <w:t xml:space="preserve">by Wingston Ng’ambi and</w:t>
+        <w:t xml:space="preserve">by Wingston Ng'ambi and</w:t>
       </w:r>
       <w:r>
         <w:t xml:space="preserve"> </w:t>
@@ -947,7 +1069,7 @@
         <w:t xml:space="preserve"> </w:t>
       </w:r>
       <w:r>
-        <w:t xml:space="preserve">which my role was to direct another researcher’s analysis rather than to conduct my own, and it</w:t>
+        <w:t xml:space="preserve">which my role was to direct another researcher's analysis rather than to conduct my own, and it</w:t>
       </w:r>
       <w:r>
         <w:t xml:space="preserve"> </w:t>
@@ -1055,7 +1177,7 @@
           <w:bCs/>
           <w:b/>
         </w:rPr>
-        <w:t xml:space="preserve">Enabling others’ research.</w:t>
+        <w:t xml:space="preserve">Enabling others' research.</w:t>
       </w:r>
       <w:r>
         <w:t xml:space="preserve"> </w:t>
@@ -1067,7 +1189,7 @@
         <w:t xml:space="preserve"> </w:t>
       </w:r>
       <w:r>
-        <w:t xml:space="preserve">people’s work. LiteRev was designed so that researchers without natural language processing</w:t>
+        <w:t xml:space="preserve">people's work. LiteRev was designed so that researchers without natural language processing</w:t>
       </w:r>
       <w:r>
         <w:t xml:space="preserve"> </w:t>
@@ -1213,14 +1335,14 @@
         <w:t xml:space="preserve">that transition; the grant is what turns a step into a practice.</w:t>
       </w:r>
     </w:p>
-    <w:bookmarkEnd w:id="25"/>
-    <w:bookmarkStart w:id="26" w:name="X5237f3440d0fbef745814ab111e4391bc87a1d1"/>
-    <w:p>
-      <w:pPr>
-        <w:pStyle w:val="Heading2"/>
-      </w:pPr>
-      <w:r>
-        <w:t xml:space="preserve">Module 3 - Contributions to the wider research and innovation community</w:t>
+    <w:bookmarkEnd w:id="28"/>
+    <w:bookmarkStart w:id="29" w:name="Xb760de0aca52c9bc0808047fe7f7a65cab0d892"/>
+    <w:p>
+      <w:pPr>
+        <w:pStyle w:val="Heading1"/>
+      </w:pPr>
+      <w:r>
+        <w:t xml:space="preserve">Module 3: Contributions to the wider research and innovation community</w:t>
       </w:r>
     </w:p>
     <w:p>
@@ -1586,14 +1708,14 @@
         <w:t xml:space="preserve">underlying problems are structurally similar and the tools are largely unknown.</w:t>
       </w:r>
     </w:p>
-    <w:bookmarkEnd w:id="26"/>
-    <w:bookmarkStart w:id="27" w:name="Xd88c382c828cb97d20b5b045e2bc3a80aa88057"/>
-    <w:p>
-      <w:pPr>
-        <w:pStyle w:val="Heading2"/>
-      </w:pPr>
-      <w:r>
-        <w:t xml:space="preserve">Module 4 - Impact beyond the scientific community, for broader society</w:t>
+    <w:bookmarkEnd w:id="29"/>
+    <w:bookmarkStart w:id="30" w:name="Xd02c82d5f0e030bd42e75d55ee0d7c0a58e5ff9"/>
+    <w:p>
+      <w:pPr>
+        <w:pStyle w:val="Heading1"/>
+      </w:pPr>
+      <w:r>
+        <w:t xml:space="preserve">Module 4: Impact beyond the scientific community, for broader society</w:t>
       </w:r>
     </w:p>
     <w:p>
@@ -1714,7 +1836,7 @@
           <w:bCs/>
           <w:b/>
         </w:rPr>
-        <w:t xml:space="preserve">l’énergie, and the Service du Médecin Cantonal</w:t>
+        <w:t xml:space="preserve">l'énergie, and the Service du Médecin Cantonal</w:t>
       </w:r>
       <w:r>
         <w:t xml:space="preserve"> </w:t>
@@ -1918,14 +2040,14 @@
         <w:t xml:space="preserve">contribution rather than an implementation detail.</w:t>
       </w:r>
     </w:p>
-    <w:bookmarkEnd w:id="27"/>
-    <w:bookmarkStart w:id="28" w:name="X8d0af6e110c0b2a9dd7ba97f77149217c30f330"/>
-    <w:p>
-      <w:pPr>
-        <w:pStyle w:val="Heading2"/>
-      </w:pPr>
-      <w:r>
-        <w:t xml:space="preserve">Research output list (10 outputs, with contribution statements)</w:t>
+    <w:bookmarkEnd w:id="30"/>
+    <w:bookmarkStart w:id="36" w:name="research-output-list-10-items"/>
+    <w:p>
+      <w:pPr>
+        <w:pStyle w:val="Heading1"/>
+      </w:pPr>
+      <w:r>
+        <w:t xml:space="preserve">Research output list: 10 items</w:t>
       </w:r>
     </w:p>
     <w:p>
@@ -2004,8 +2126,7 @@
         </w:pict>
       </w:r>
     </w:p>
-    <w:bookmarkEnd w:id="28"/>
-    <w:bookmarkStart w:id="29" w:name="X16d2b9b2b4a244a2a742463b2ad51db052eac8d"/>
+    <w:bookmarkStart w:id="31" w:name="X16d2b9b2b4a244a2a742463b2ad51db052eac8d"/>
     <w:p>
       <w:pPr>
         <w:pStyle w:val="Heading2"/>
@@ -2059,116 +2180,113 @@
     </w:p>
     <w:p>
       <w:pPr>
-        <w:pStyle w:val="BodyText"/>
-      </w:pPr>
-      <w:r>
-        <w:rPr>
-          <w:bCs/>
-          <w:b/>
-        </w:rPr>
-        <w:t xml:space="preserve">2. Orel E.</w:t>
-      </w:r>
-      <w:r>
-        <w:t xml:space="preserve"> </w:t>
-      </w:r>
-      <w:r>
-        <w:t xml:space="preserve">LiteRev-Evidence: a platform for structured quantitative evidence extraction and</w:t>
-      </w:r>
-      <w:r>
-        <w:t xml:space="preserve"> </w:t>
-      </w:r>
-      <w:r>
-        <w:t xml:space="preserve">scenario modelling. Software and research resource, 2024–. literev-scenario.com</w:t>
-      </w:r>
-    </w:p>
-    <w:p>
-      <w:pPr>
-        <w:pStyle w:val="BodyText"/>
-      </w:pPr>
-      <w:r>
-        <w:rPr>
-          <w:bCs/>
-          <w:b/>
-        </w:rPr>
-        <w:t xml:space="preserve">3. Orel E</w:t>
-      </w:r>
-      <w:r>
-        <w:t xml:space="preserve">, Esra R, Estill J, Thiabaud A, Marchand-Maillet S, Merzouki A, Keiser O.</w:t>
-      </w:r>
-      <w:r>
-        <w:t xml:space="preserve"> </w:t>
-      </w:r>
-      <w:r>
-        <w:t xml:space="preserve">Prediction of HIV status based on socio-behavioural characteristics in East and Southern Africa.</w:t>
-      </w:r>
-      <w:r>
-        <w:t xml:space="preserve"> </w:t>
-      </w:r>
+        <w:pStyle w:val="BlockText"/>
+      </w:pPr>
       <w:r>
         <w:rPr>
           <w:iCs/>
           <w:i/>
         </w:rPr>
-        <w:t xml:space="preserve">PLoS ONE</w:t>
-      </w:r>
-      <w:r>
-        <w:t xml:space="preserve"> </w:t>
-      </w:r>
-      <w:r>
-        <w:t xml:space="preserve">2022;17(3):e0264429.</w:t>
-      </w:r>
-    </w:p>
-    <w:p>
-      <w:pPr>
-        <w:pStyle w:val="BodyText"/>
-      </w:pPr>
-      <w:r>
-        <w:rPr>
-          <w:bCs/>
-          <w:b/>
-        </w:rPr>
-        <w:t xml:space="preserve">4. Orel E</w:t>
-      </w:r>
-      <w:r>
-        <w:t xml:space="preserve">, Sobel J, Zanella MC, Iten A, Kaiser L, Keiser O, Vetter P.</w:t>
-      </w:r>
-      <w:r>
-        <w:t xml:space="preserve"> </w:t>
-      </w:r>
-      <w:r>
-        <w:t xml:space="preserve">Difference in clinical severity between Delta variant and Omicron sub-lineages in a Swiss</w:t>
-      </w:r>
-      <w:r>
-        <w:t xml:space="preserve"> </w:t>
-      </w:r>
-      <w:r>
-        <w:t xml:space="preserve">tertiary center.</w:t>
-      </w:r>
-      <w:r>
-        <w:t xml:space="preserve"> </w:t>
-      </w:r>
+        <w:t xml:space="preserve">Contribution:</w:t>
+      </w:r>
+      <w:r>
+        <w:t xml:space="preserve"> </w:t>
+      </w:r>
+      <w:r>
+        <w:t xml:space="preserve">First author. Conceived the tool, designed and implemented the NLP,</w:t>
+      </w:r>
+      <w:r>
+        <w:t xml:space="preserve"> </w:t>
+      </w:r>
+      <w:r>
+        <w:t xml:space="preserve">dimensionality-reduction and clustering pipeline, conducted the performance evaluation, wrote</w:t>
+      </w:r>
+      <w:r>
+        <w:t xml:space="preserve"> </w:t>
+      </w:r>
+      <w:r>
+        <w:t xml:space="preserve">the manuscript. Raised its funding on my own initiative (UNIGE CHF 30,000, Fondation Ernst et</w:t>
+      </w:r>
+      <w:r>
+        <w:t xml:space="preserve"> </w:t>
+      </w:r>
+      <w:r>
+        <w:t xml:space="preserve">Lucie Schmidheiny CHF 10,000, Venture Kick CHF 10,000, Mimosa CHF 20,000). Now used by other</w:t>
+      </w:r>
+      <w:r>
+        <w:t xml:space="preserve"> </w:t>
+      </w:r>
+      <w:r>
+        <w:t xml:space="preserve">groups, including in the systematic review at item 5.</w:t>
+      </w:r>
+    </w:p>
+    <w:p>
+      <w:pPr>
+        <w:pStyle w:val="FirstParagraph"/>
+      </w:pPr>
+      <w:r>
+        <w:rPr>
+          <w:bCs/>
+          <w:b/>
+        </w:rPr>
+        <w:t xml:space="preserve">2. Orel E.</w:t>
+      </w:r>
+      <w:r>
+        <w:t xml:space="preserve"> </w:t>
+      </w:r>
+      <w:r>
+        <w:t xml:space="preserve">LiteRev-Evidence: a platform for structured quantitative evidence extraction and</w:t>
+      </w:r>
+      <w:r>
+        <w:t xml:space="preserve"> </w:t>
+      </w:r>
+      <w:r>
+        <w:t xml:space="preserve">scenario modelling. Software and research resource, 2024–. literev-scenario.com</w:t>
+      </w:r>
+    </w:p>
+    <w:p>
+      <w:pPr>
+        <w:pStyle w:val="BlockText"/>
+      </w:pPr>
       <w:r>
         <w:rPr>
           <w:iCs/>
           <w:i/>
         </w:rPr>
-        <w:t xml:space="preserve">CMI Communications</w:t>
-      </w:r>
-      <w:r>
-        <w:t xml:space="preserve"> </w:t>
-      </w:r>
-      <w:r>
-        <w:t xml:space="preserve">2024.</w:t>
-      </w:r>
-    </w:p>
-    <w:bookmarkEnd w:id="29"/>
-    <w:bookmarkStart w:id="30" w:name="X74c655e24a89249cd8a748e3c3241863085d74b"/>
-    <w:p>
-      <w:pPr>
-        <w:pStyle w:val="Heading2"/>
-      </w:pPr>
-      <w:r>
-        <w:t xml:space="preserve">Module 2: Development of other individuals and research teams (2)</w:t>
+        <w:t xml:space="preserve">Contribution:</w:t>
+      </w:r>
+      <w:r>
+        <w:t xml:space="preserve"> </w:t>
+      </w:r>
+      <w:r>
+        <w:t xml:space="preserve">Sole architect and developer. The full review pipeline in working form:</w:t>
+      </w:r>
+      <w:r>
+        <w:t xml:space="preserve"> </w:t>
+      </w:r>
+      <w:r>
+        <w:t xml:space="preserve">live federated search of the open literature from natural-language or Boolean queries,</w:t>
+      </w:r>
+      <w:r>
+        <w:t xml:space="preserve"> </w:t>
+      </w:r>
+      <w:r>
+        <w:t xml:space="preserve">screening, living reviews, provenance-tracked and quality-weighted extraction pooled into</w:t>
+      </w:r>
+      <w:r>
+        <w:t xml:space="preserve"> </w:t>
+      </w:r>
+      <w:r>
+        <w:t xml:space="preserve">parameter distributions, and the modelling components that consume them.</w:t>
+      </w:r>
+      <w:r>
+        <w:t xml:space="preserve"> </w:t>
+      </w:r>
+      <w:r>
+        <w:rPr>
+          <w:rStyle w:val="VerbatimChar"/>
+        </w:rPr>
+        <w:t xml:space="preserve">[[Consider depositing a versioned release with a DOI (Zenodo) before submission - a citable identifier makes a software output count as an output rather than as a claim.]]</w:t>
       </w:r>
     </w:p>
     <w:p>
@@ -2180,168 +2298,16 @@
           <w:bCs/>
           <w:b/>
         </w:rPr>
-        <w:t xml:space="preserve">5.</w:t>
-      </w:r>
-      <w:r>
-        <w:t xml:space="preserve"> </w:t>
-      </w:r>
-      <w:r>
-        <w:t xml:space="preserve">Ng’ambi W, Estill J, Keiser O, Merzouki FA,</w:t>
-      </w:r>
-      <w:r>
-        <w:t xml:space="preserve"> </w:t>
-      </w:r>
-      <w:r>
-        <w:rPr>
-          <w:bCs/>
-          <w:b/>
-        </w:rPr>
-        <w:t xml:space="preserve">Orel E</w:t>
-      </w:r>
-      <w:r>
-        <w:t xml:space="preserve">.</w:t>
-      </w:r>
-      <w:r>
-        <w:t xml:space="preserve"> </w:t>
-      </w:r>
-      <w:r>
-        <w:t xml:space="preserve">Machine learning-based classification of self-reported cardiovascular disease history in Africa</w:t>
-      </w:r>
-      <w:r>
-        <w:t xml:space="preserve"> </w:t>
-      </w:r>
-      <w:r>
-        <w:t xml:space="preserve">using harmonised multi-country WHO STEPS surveys: 2014–2019.</w:t>
-      </w:r>
-      <w:r>
-        <w:t xml:space="preserve"> </w:t>
-      </w:r>
-      <w:r>
-        <w:rPr>
-          <w:bCs/>
-          <w:b/>
-        </w:rPr>
-        <w:t xml:space="preserve">Accepted for publication.</w:t>
-      </w:r>
-      <w:r>
-        <w:t xml:space="preserve"> </w:t>
-      </w:r>
-      <w:r>
-        <w:rPr>
-          <w:rStyle w:val="VerbatimChar"/>
-        </w:rPr>
-        <w:t xml:space="preserve">[[Venue, year, DOI once assigned]]</w:t>
-      </w:r>
-    </w:p>
-    <w:p>
-      <w:pPr>
-        <w:pStyle w:val="BodyText"/>
-      </w:pPr>
-      <w:r>
-        <w:rPr>
-          <w:bCs/>
-          <w:b/>
-        </w:rPr>
-        <w:t xml:space="preserve">6.</w:t>
-      </w:r>
-      <w:r>
-        <w:t xml:space="preserve"> </w:t>
-      </w:r>
-      <w:r>
-        <w:t xml:space="preserve">Edjinedja KL, Larribau R,</w:t>
-      </w:r>
-      <w:r>
-        <w:t xml:space="preserve"> </w:t>
-      </w:r>
-      <w:r>
-        <w:rPr>
-          <w:bCs/>
-          <w:b/>
-        </w:rPr>
-        <w:t xml:space="preserve">Orel E</w:t>
-      </w:r>
-      <w:r>
-        <w:t xml:space="preserve">, Cossus J, Elfahim O, Yendouname K, Vaussenat F,</w:t>
-      </w:r>
-      <w:r>
-        <w:t xml:space="preserve"> </w:t>
-      </w:r>
-      <w:r>
-        <w:t xml:space="preserve">Teodoro D, Robert-Nicoud S, Barakat O, Desmettre T.</w:t>
-      </w:r>
-      <w:r>
-        <w:t xml:space="preserve"> </w:t>
-      </w:r>
-      <w:r>
-        <w:t xml:space="preserve">Artificial intelligence in emergency medical services for disasters and health emergencies:</w:t>
-      </w:r>
-      <w:r>
-        <w:t xml:space="preserve"> </w:t>
-      </w:r>
-      <w:r>
-        <w:t xml:space="preserve">a systematic review.</w:t>
-      </w:r>
-      <w:r>
-        <w:t xml:space="preserve"> </w:t>
-      </w:r>
-      <w:r>
-        <w:rPr>
-          <w:rStyle w:val="VerbatimChar"/>
-        </w:rPr>
-        <w:t xml:space="preserve">[[Submitted 2026 - update status and venue]]</w:t>
-      </w:r>
-    </w:p>
-    <w:bookmarkEnd w:id="30"/>
-    <w:bookmarkStart w:id="31" w:name="Xe4a83e14d7c14eb91d8c73a097532799e64e66d"/>
-    <w:p>
-      <w:pPr>
-        <w:pStyle w:val="Heading2"/>
-      </w:pPr>
-      <w:r>
-        <w:t xml:space="preserve">Module 3: Contributions to the wider research and innovation community (2)</w:t>
-      </w:r>
-    </w:p>
-    <w:p>
-      <w:pPr>
-        <w:pStyle w:val="FirstParagraph"/>
-      </w:pPr>
-      <w:r>
-        <w:rPr>
-          <w:bCs/>
-          <w:b/>
-        </w:rPr>
-        <w:t xml:space="preserve">7.</w:t>
-      </w:r>
-      <w:r>
-        <w:t xml:space="preserve"> </w:t>
-      </w:r>
-      <w:r>
-        <w:t xml:space="preserve">Nwosu KD, Fokam J, Wanda F, Mama L,</w:t>
-      </w:r>
-      <w:r>
-        <w:t xml:space="preserve"> </w:t>
-      </w:r>
-      <w:r>
-        <w:rPr>
-          <w:bCs/>
-          <w:b/>
-        </w:rPr>
-        <w:t xml:space="preserve">Orel E</w:t>
-      </w:r>
-      <w:r>
-        <w:t xml:space="preserve">, Ray N, Meke J, Tassegning A, Takou D,</w:t>
-      </w:r>
-      <w:r>
-        <w:t xml:space="preserve"> </w:t>
-      </w:r>
-      <w:r>
-        <w:t xml:space="preserve">Mimbe E, Stoll B, Guillebert J, Comte E, Keiser O, Ciaffi L.</w:t>
-      </w:r>
-      <w:r>
-        <w:t xml:space="preserve"> </w:t>
-      </w:r>
-      <w:r>
-        <w:t xml:space="preserve">SARS-CoV-2 antibody seroprevalence and associated risk factors in an urban district in Cameroon.</w:t>
+        <w:t xml:space="preserve">3. Orel E</w:t>
+      </w:r>
+      <w:r>
+        <w:t xml:space="preserve">, Esra R, Estill J, Thiabaud A, Marchand-Maillet S, Merzouki A, Keiser O.</w:t>
+      </w:r>
+      <w:r>
+        <w:t xml:space="preserve"> </w:t>
+      </w:r>
+      <w:r>
+        <w:t xml:space="preserve">Prediction of HIV status based on socio-behavioural characteristics in East and Southern Africa.</w:t>
       </w:r>
       <w:r>
         <w:t xml:space="preserve"> </w:t>
@@ -2351,59 +2317,443 @@
           <w:iCs/>
           <w:i/>
         </w:rPr>
-        <w:t xml:space="preserve">Nature Communications</w:t>
-      </w:r>
-      <w:r>
-        <w:t xml:space="preserve"> </w:t>
-      </w:r>
-      <w:r>
-        <w:t xml:space="preserve">2021;12:5851. doi:10.1038/s41467-021-25946-0</w:t>
-      </w:r>
-    </w:p>
-    <w:p>
-      <w:pPr>
-        <w:pStyle w:val="BodyText"/>
-      </w:pPr>
-      <w:r>
-        <w:rPr>
-          <w:bCs/>
-          <w:b/>
-        </w:rPr>
-        <w:t xml:space="preserve">8.</w:t>
-      </w:r>
-      <w:r>
-        <w:t xml:space="preserve"> </w:t>
-      </w:r>
-      <w:r>
-        <w:t xml:space="preserve">Estill J, Venkova-Marchevska P, Roelens M,</w:t>
-      </w:r>
-      <w:r>
-        <w:t xml:space="preserve"> </w:t>
-      </w:r>
-      <w:r>
-        <w:rPr>
-          <w:bCs/>
-          <w:b/>
-        </w:rPr>
-        <w:t xml:space="preserve">Orel E</w:t>
-      </w:r>
-      <w:r>
-        <w:t xml:space="preserve">, Temerev A, Flahault A, Keiser O.</w:t>
-      </w:r>
-      <w:r>
-        <w:t xml:space="preserve"> </w:t>
-      </w:r>
-      <w:r>
-        <w:t xml:space="preserve">Future scenarios for the SARS-CoV-2 epidemic in Switzerland: an age-structured model.</w:t>
-      </w:r>
-      <w:r>
-        <w:t xml:space="preserve"> </w:t>
-      </w:r>
+        <w:t xml:space="preserve">PLoS ONE</w:t>
+      </w:r>
+      <w:r>
+        <w:t xml:space="preserve"> </w:t>
+      </w:r>
+      <w:r>
+        <w:t xml:space="preserve">2022;17(3):e0264429.</w:t>
+      </w:r>
+    </w:p>
+    <w:p>
+      <w:pPr>
+        <w:pStyle w:val="BlockText"/>
+      </w:pPr>
       <w:r>
         <w:rPr>
           <w:iCs/>
           <w:i/>
         </w:rPr>
+        <w:t xml:space="preserve">Contribution:</w:t>
+      </w:r>
+      <w:r>
+        <w:t xml:space="preserve"> </w:t>
+      </w:r>
+      <w:r>
+        <w:t xml:space="preserve">First author. Designed the analysis, implemented the gradient-boosted models,</w:t>
+      </w:r>
+      <w:r>
+        <w:t xml:space="preserve"> </w:t>
+      </w:r>
+      <w:r>
+        <w:t xml:space="preserve">conducted the cross-country transportability assessment, wrote the manuscript.</w:t>
+      </w:r>
+    </w:p>
+    <w:p>
+      <w:pPr>
+        <w:pStyle w:val="FirstParagraph"/>
+      </w:pPr>
+      <w:r>
+        <w:rPr>
+          <w:bCs/>
+          <w:b/>
+        </w:rPr>
+        <w:t xml:space="preserve">4. Orel E</w:t>
+      </w:r>
+      <w:r>
+        <w:t xml:space="preserve">, Sobel J, Zanella MC, Iten A, Kaiser L, Keiser O, Vetter P.</w:t>
+      </w:r>
+      <w:r>
+        <w:t xml:space="preserve"> </w:t>
+      </w:r>
+      <w:r>
+        <w:t xml:space="preserve">Difference in clinical severity between Delta variant and Omicron sub-lineages in a Swiss</w:t>
+      </w:r>
+      <w:r>
+        <w:t xml:space="preserve"> </w:t>
+      </w:r>
+      <w:r>
+        <w:t xml:space="preserve">tertiary center.</w:t>
+      </w:r>
+      <w:r>
+        <w:t xml:space="preserve"> </w:t>
+      </w:r>
+      <w:r>
+        <w:rPr>
+          <w:iCs/>
+          <w:i/>
+        </w:rPr>
+        <w:t xml:space="preserve">CMI Communications</w:t>
+      </w:r>
+      <w:r>
+        <w:t xml:space="preserve"> </w:t>
+      </w:r>
+      <w:r>
+        <w:t xml:space="preserve">2024.</w:t>
+      </w:r>
+    </w:p>
+    <w:p>
+      <w:pPr>
+        <w:pStyle w:val="BlockText"/>
+      </w:pPr>
+      <w:r>
+        <w:rPr>
+          <w:iCs/>
+          <w:i/>
+        </w:rPr>
+        <w:t xml:space="preserve">Contribution:</w:t>
+      </w:r>
+      <w:r>
+        <w:t xml:space="preserve"> </w:t>
+      </w:r>
+      <w:r>
+        <w:t xml:space="preserve">First author. Designed and conducted the analysis of hospital clinical data,</w:t>
+      </w:r>
+      <w:r>
+        <w:t xml:space="preserve"> </w:t>
+      </w:r>
+      <w:r>
+        <w:t xml:space="preserve">wrote the manuscript.</w:t>
+      </w:r>
+    </w:p>
+    <w:bookmarkEnd w:id="31"/>
+    <w:bookmarkStart w:id="32" w:name="X74c655e24a89249cd8a748e3c3241863085d74b"/>
+    <w:p>
+      <w:pPr>
+        <w:pStyle w:val="Heading2"/>
+      </w:pPr>
+      <w:r>
+        <w:t xml:space="preserve">Module 2: Development of other individuals and research teams (2)</w:t>
+      </w:r>
+    </w:p>
+    <w:p>
+      <w:pPr>
+        <w:pStyle w:val="FirstParagraph"/>
+      </w:pPr>
+      <w:r>
+        <w:rPr>
+          <w:bCs/>
+          <w:b/>
+        </w:rPr>
+        <w:t xml:space="preserve">5.</w:t>
+      </w:r>
+      <w:r>
+        <w:t xml:space="preserve"> </w:t>
+      </w:r>
+      <w:r>
+        <w:t xml:space="preserve">Ng'ambi W, Estill J, Keiser O, Merzouki FA,</w:t>
+      </w:r>
+      <w:r>
+        <w:t xml:space="preserve"> </w:t>
+      </w:r>
+      <w:r>
+        <w:rPr>
+          <w:bCs/>
+          <w:b/>
+        </w:rPr>
+        <w:t xml:space="preserve">Orel E</w:t>
+      </w:r>
+      <w:r>
+        <w:t xml:space="preserve">.</w:t>
+      </w:r>
+      <w:r>
+        <w:t xml:space="preserve"> </w:t>
+      </w:r>
+      <w:r>
+        <w:t xml:space="preserve">Machine learning-based classification of self-reported cardiovascular disease history in Africa</w:t>
+      </w:r>
+      <w:r>
+        <w:t xml:space="preserve"> </w:t>
+      </w:r>
+      <w:r>
+        <w:t xml:space="preserve">using harmonised multi-country WHO STEPS surveys: 2014–2019.</w:t>
+      </w:r>
+      <w:r>
+        <w:t xml:space="preserve"> </w:t>
+      </w:r>
+      <w:r>
+        <w:rPr>
+          <w:bCs/>
+          <w:b/>
+        </w:rPr>
+        <w:t xml:space="preserve">Accepted for publication.</w:t>
+      </w:r>
+      <w:r>
+        <w:t xml:space="preserve"> </w:t>
+      </w:r>
+      <w:r>
+        <w:rPr>
+          <w:rStyle w:val="VerbatimChar"/>
+        </w:rPr>
+        <w:t xml:space="preserve">[[Venue, year, DOI once assigned]]</w:t>
+      </w:r>
+    </w:p>
+    <w:p>
+      <w:pPr>
+        <w:pStyle w:val="BlockText"/>
+      </w:pPr>
+      <w:r>
+        <w:rPr>
+          <w:iCs/>
+          <w:i/>
+        </w:rPr>
+        <w:t xml:space="preserve">Contribution:</w:t>
+      </w:r>
+      <w:r>
+        <w:t xml:space="preserve"> </w:t>
+      </w:r>
+      <w:r>
+        <w:rPr>
+          <w:bCs/>
+          <w:b/>
+        </w:rPr>
+        <w:t xml:space="preserve">Last (senior) author.</w:t>
+      </w:r>
+      <w:r>
+        <w:t xml:space="preserve"> </w:t>
+      </w:r>
+      <w:r>
+        <w:rPr>
+          <w:rStyle w:val="VerbatimChar"/>
+        </w:rPr>
+        <w:t xml:space="preserve">[[State the actual role in one precise line - e.g. supervised the machine-learning methodology and analysis design, guided the revision.]]</w:t>
+      </w:r>
+      <w:r>
+        <w:t xml:space="preserve"> </w:t>
+      </w:r>
+      <w:r>
+        <w:t xml:space="preserve">Senior-authoring the work of the first author marks the transition from contributing to</w:t>
+      </w:r>
+      <w:r>
+        <w:t xml:space="preserve"> </w:t>
+      </w:r>
+      <w:r>
+        <w:t xml:space="preserve">collaborative analyses to directing them.</w:t>
+      </w:r>
+    </w:p>
+    <w:p>
+      <w:pPr>
+        <w:pStyle w:val="FirstParagraph"/>
+      </w:pPr>
+      <w:r>
+        <w:rPr>
+          <w:bCs/>
+          <w:b/>
+        </w:rPr>
+        <w:t xml:space="preserve">6.</w:t>
+      </w:r>
+      <w:r>
+        <w:t xml:space="preserve"> </w:t>
+      </w:r>
+      <w:r>
+        <w:t xml:space="preserve">Edjinedja KL, Larribau R,</w:t>
+      </w:r>
+      <w:r>
+        <w:t xml:space="preserve"> </w:t>
+      </w:r>
+      <w:r>
+        <w:rPr>
+          <w:bCs/>
+          <w:b/>
+        </w:rPr>
+        <w:t xml:space="preserve">Orel E</w:t>
+      </w:r>
+      <w:r>
+        <w:t xml:space="preserve">, Cossus J, Elfahim O, Yendouname K, Vaussenat F,</w:t>
+      </w:r>
+      <w:r>
+        <w:t xml:space="preserve"> </w:t>
+      </w:r>
+      <w:r>
+        <w:t xml:space="preserve">Teodoro D, Robert-Nicoud S, Barakat O, Desmettre T.</w:t>
+      </w:r>
+      <w:r>
+        <w:t xml:space="preserve"> </w:t>
+      </w:r>
+      <w:r>
+        <w:t xml:space="preserve">Artificial intelligence in emergency medical services for disasters and health emergencies:</w:t>
+      </w:r>
+      <w:r>
+        <w:t xml:space="preserve"> </w:t>
+      </w:r>
+      <w:r>
+        <w:t xml:space="preserve">a systematic review.</w:t>
+      </w:r>
+      <w:r>
+        <w:t xml:space="preserve"> </w:t>
+      </w:r>
+      <w:r>
+        <w:rPr>
+          <w:rStyle w:val="VerbatimChar"/>
+        </w:rPr>
+        <w:t xml:space="preserve">[[Submitted 2026 - update status and venue]]</w:t>
+      </w:r>
+    </w:p>
+    <w:p>
+      <w:pPr>
+        <w:pStyle w:val="BlockText"/>
+      </w:pPr>
+      <w:r>
+        <w:rPr>
+          <w:iCs/>
+          <w:i/>
+        </w:rPr>
+        <w:t xml:space="preserve">Contribution:</w:t>
+      </w:r>
+      <w:r>
+        <w:t xml:space="preserve"> </w:t>
+      </w:r>
+      <w:r>
+        <w:t xml:space="preserve">Third author. Provided the methodological infrastructure (LiteRev, used in the</w:t>
+      </w:r>
+      <w:r>
+        <w:t xml:space="preserve"> </w:t>
+      </w:r>
+      <w:r>
+        <w:t xml:space="preserve">published methods to structure the review corpus) and guided its application through</w:t>
+      </w:r>
+      <w:r>
+        <w:t xml:space="preserve"> </w:t>
+      </w:r>
+      <w:r>
+        <w:t xml:space="preserve">screening and clustering, working with the doctoral researcher leading the review.</w:t>
+      </w:r>
+    </w:p>
+    <w:bookmarkEnd w:id="32"/>
+    <w:bookmarkStart w:id="33" w:name="Xe4a83e14d7c14eb91d8c73a097532799e64e66d"/>
+    <w:p>
+      <w:pPr>
+        <w:pStyle w:val="Heading2"/>
+      </w:pPr>
+      <w:r>
+        <w:t xml:space="preserve">Module 3: Contributions to the wider research and innovation community (2)</w:t>
+      </w:r>
+    </w:p>
+    <w:p>
+      <w:pPr>
+        <w:pStyle w:val="FirstParagraph"/>
+      </w:pPr>
+      <w:r>
+        <w:rPr>
+          <w:bCs/>
+          <w:b/>
+        </w:rPr>
+        <w:t xml:space="preserve">7.</w:t>
+      </w:r>
+      <w:r>
+        <w:t xml:space="preserve"> </w:t>
+      </w:r>
+      <w:r>
+        <w:t xml:space="preserve">Nwosu KD, Fokam J, Wanda F, Mama L,</w:t>
+      </w:r>
+      <w:r>
+        <w:t xml:space="preserve"> </w:t>
+      </w:r>
+      <w:r>
+        <w:rPr>
+          <w:bCs/>
+          <w:b/>
+        </w:rPr>
+        <w:t xml:space="preserve">Orel E</w:t>
+      </w:r>
+      <w:r>
+        <w:t xml:space="preserve">, Ray N, Meke J, Tassegning A, Takou D,</w:t>
+      </w:r>
+      <w:r>
+        <w:t xml:space="preserve"> </w:t>
+      </w:r>
+      <w:r>
+        <w:t xml:space="preserve">Mimbe E, Stoll B, Guillebert J, Comte E, Keiser O, Ciaffi L.</w:t>
+      </w:r>
+      <w:r>
+        <w:t xml:space="preserve"> </w:t>
+      </w:r>
+      <w:r>
+        <w:t xml:space="preserve">SARS-CoV-2 antibody seroprevalence and associated risk factors in an urban district in Cameroon.</w:t>
+      </w:r>
+      <w:r>
+        <w:t xml:space="preserve"> </w:t>
+      </w:r>
+      <w:r>
+        <w:rPr>
+          <w:iCs/>
+          <w:i/>
+        </w:rPr>
+        <w:t xml:space="preserve">Nature Communications</w:t>
+      </w:r>
+      <w:r>
+        <w:t xml:space="preserve"> </w:t>
+      </w:r>
+      <w:r>
+        <w:t xml:space="preserve">2021;12:5851. doi:10.1038/s41467-021-25946-0</w:t>
+      </w:r>
+    </w:p>
+    <w:p>
+      <w:pPr>
+        <w:pStyle w:val="BlockText"/>
+      </w:pPr>
+      <w:r>
+        <w:rPr>
+          <w:iCs/>
+          <w:i/>
+        </w:rPr>
+        <w:t xml:space="preserve">Contribution:</w:t>
+      </w:r>
+      <w:r>
+        <w:t xml:space="preserve"> </w:t>
+      </w:r>
+      <w:r>
+        <w:rPr>
+          <w:rStyle w:val="VerbatimChar"/>
+        </w:rPr>
+        <w:t xml:space="preserve">[[State your specific role - statistical analysis? risk factor modelling? One precise line is worth more than the author position, and this is your highest-visibility venue.]]</w:t>
+      </w:r>
+    </w:p>
+    <w:p>
+      <w:pPr>
+        <w:pStyle w:val="FirstParagraph"/>
+      </w:pPr>
+      <w:r>
+        <w:rPr>
+          <w:bCs/>
+          <w:b/>
+        </w:rPr>
+        <w:t xml:space="preserve">8.</w:t>
+      </w:r>
+      <w:r>
+        <w:t xml:space="preserve"> </w:t>
+      </w:r>
+      <w:r>
+        <w:t xml:space="preserve">Estill J, Venkova-Marchevska P, Roelens M,</w:t>
+      </w:r>
+      <w:r>
+        <w:t xml:space="preserve"> </w:t>
+      </w:r>
+      <w:r>
+        <w:rPr>
+          <w:bCs/>
+          <w:b/>
+        </w:rPr>
+        <w:t xml:space="preserve">Orel E</w:t>
+      </w:r>
+      <w:r>
+        <w:t xml:space="preserve">, Temerev A, Flahault A, Keiser O.</w:t>
+      </w:r>
+      <w:r>
+        <w:t xml:space="preserve"> </w:t>
+      </w:r>
+      <w:r>
+        <w:t xml:space="preserve">Future scenarios for the SARS-CoV-2 epidemic in Switzerland: an age-structured model.</w:t>
+      </w:r>
+      <w:r>
+        <w:t xml:space="preserve"> </w:t>
+      </w:r>
+      <w:r>
+        <w:rPr>
+          <w:iCs/>
+          <w:i/>
+        </w:rPr>
         <w:t xml:space="preserve">F1000Research</w:t>
       </w:r>
       <w:r>
@@ -2413,8 +2763,41 @@
         <w:t xml:space="preserve">2020;9.</w:t>
       </w:r>
     </w:p>
-    <w:bookmarkEnd w:id="31"/>
-    <w:bookmarkStart w:id="32" w:name="Xb0ea19ac6a8b59dbd895712f9d00d9d37e6deac"/>
+    <w:p>
+      <w:pPr>
+        <w:pStyle w:val="BlockText"/>
+      </w:pPr>
+      <w:r>
+        <w:rPr>
+          <w:iCs/>
+          <w:i/>
+        </w:rPr>
+        <w:t xml:space="preserve">Contribution:</w:t>
+      </w:r>
+      <w:r>
+        <w:t xml:space="preserve"> </w:t>
+      </w:r>
+      <w:r>
+        <w:rPr>
+          <w:rStyle w:val="VerbatimChar"/>
+        </w:rPr>
+        <w:t xml:space="preserve">[[Specify - model implementation? scenario design?]]</w:t>
+      </w:r>
+      <w:r>
+        <w:t xml:space="preserve"> </w:t>
+      </w:r>
+      <w:r>
+        <w:t xml:space="preserve">Contributed to</w:t>
+      </w:r>
+      <w:r>
+        <w:t xml:space="preserve"> </w:t>
+      </w:r>
+      <w:r>
+        <w:t xml:space="preserve">age-structured scenario modelling produced for Swiss pandemic planning under time pressure.</w:t>
+      </w:r>
+    </w:p>
+    <w:bookmarkEnd w:id="33"/>
+    <w:bookmarkStart w:id="34" w:name="Xb0ea19ac6a8b59dbd895712f9d00d9d37e6deac"/>
     <w:p>
       <w:pPr>
         <w:pStyle w:val="Heading2"/>
@@ -2449,7 +2832,40 @@
     </w:p>
     <w:p>
       <w:pPr>
-        <w:pStyle w:val="BodyText"/>
+        <w:pStyle w:val="BlockText"/>
+      </w:pPr>
+      <w:r>
+        <w:rPr>
+          <w:iCs/>
+          <w:i/>
+        </w:rPr>
+        <w:t xml:space="preserve">Contribution:</w:t>
+      </w:r>
+      <w:r>
+        <w:t xml:space="preserve"> </w:t>
+      </w:r>
+      <w:r>
+        <w:t xml:space="preserve">Designed and built the dashboard (R Markdown) used for regional situational</w:t>
+      </w:r>
+      <w:r>
+        <w:t xml:space="preserve"> </w:t>
+      </w:r>
+      <w:r>
+        <w:t xml:space="preserve">awareness across the WHO African Region during the pandemic.</w:t>
+      </w:r>
+      <w:r>
+        <w:t xml:space="preserve"> </w:t>
+      </w:r>
+      <w:r>
+        <w:rPr>
+          <w:rStyle w:val="VerbatimChar"/>
+        </w:rPr>
+        <w:t xml:space="preserve">[[If a URL, report or archived version exists, cite it - an output a reviewer cannot see is hard to credit.]]</w:t>
+      </w:r>
+    </w:p>
+    <w:p>
+      <w:pPr>
+        <w:pStyle w:val="FirstParagraph"/>
       </w:pPr>
       <w:r>
         <w:rPr>
@@ -2480,7 +2896,52 @@
         <w:t xml:space="preserve"> </w:t>
       </w:r>
       <w:r>
-        <w:t xml:space="preserve">cantonale d’éthique de la recherche, Geneva, 2026.</w:t>
+        <w:t xml:space="preserve">cantonale d'éthique de la recherche, Geneva, 2026.</w:t>
+      </w:r>
+    </w:p>
+    <w:p>
+      <w:pPr>
+        <w:pStyle w:val="BlockText"/>
+      </w:pPr>
+      <w:r>
+        <w:rPr>
+          <w:iCs/>
+          <w:i/>
+        </w:rPr>
+        <w:t xml:space="preserve">Contribution:</w:t>
+      </w:r>
+      <w:r>
+        <w:t xml:space="preserve"> </w:t>
+      </w:r>
+      <w:r>
+        <w:t xml:space="preserve">Designed and built the linkage between the cantonal legionellosis case registry</w:t>
+      </w:r>
+      <w:r>
+        <w:t xml:space="preserve"> </w:t>
+      </w:r>
+      <w:r>
+        <w:t xml:space="preserve">and individual hot water installation records - a dataset with no equivalent elsewhere - and</w:t>
+      </w:r>
+      <w:r>
+        <w:t xml:space="preserve"> </w:t>
+      </w:r>
+      <w:r>
+        <w:t xml:space="preserve">secured funding from Services Industriels de Genève, the Office cantonal de l'énergie and the</w:t>
+      </w:r>
+      <w:r>
+        <w:t xml:space="preserve"> </w:t>
+      </w:r>
+      <w:r>
+        <w:t xml:space="preserve">Service du Médecin Cantonal.</w:t>
+      </w:r>
+      <w:r>
+        <w:t xml:space="preserve"> </w:t>
+      </w:r>
+      <w:r>
+        <w:rPr>
+          <w:rStyle w:val="VerbatimChar"/>
+        </w:rPr>
+        <w:t xml:space="preserve">[[~CHF 90,000 - confirm.]]</w:t>
       </w:r>
     </w:p>
     <w:p>
@@ -2490,8 +2951,8 @@
         </w:pict>
       </w:r>
     </w:p>
-    <w:bookmarkEnd w:id="32"/>
-    <w:bookmarkStart w:id="33" w:name="notes-on-what-was-left-out-and-why"/>
+    <w:bookmarkEnd w:id="34"/>
+    <w:bookmarkStart w:id="35" w:name="notes-on-what-was-left-out-and-why"/>
     <w:p>
       <w:pPr>
         <w:pStyle w:val="Heading2"/>
@@ -2715,30 +3176,6 @@
       </w:r>
       <w:r>
         <w:t xml:space="preserve">for prediction and evidence synthesis, applied to public health problems, increasingly led by me</w:t>
-      </w:r>
-      <w:r>
-        <w:t xml:space="preserve"> </w:t>
-      </w:r>
-      <w:r>
-        <w:t xml:space="preserve">- rather than sampling the record evenly. A narrative CV rewards judgement about your own work,</w:t>
-      </w:r>
-      <w:r>
-        <w:t xml:space="preserve"> </w:t>
-      </w:r>
-      <w:r>
-        <w:t xml:space="preserve">and a list that showed everything would show no judgement at all.</w:t>
-      </w:r>
-    </w:p>
-    <w:p>
-      <w:pPr>
-        <w:pStyle w:val="BodyText"/>
-      </w:pPr>
-      <w:r>
-        <w:rPr>
-          <w:bCs/>
-          <w:b/>
-        </w:rPr>
-        <w:t xml:space="preserve">Two decisions worth revisiting before you submit:</w:t>
       </w:r>
     </w:p>
     <w:p>
@@ -2750,48 +3187,32 @@
         <w:pStyle w:val="Compact"/>
       </w:pPr>
       <w:r>
-        <w:rPr>
-          <w:bCs/>
-          <w:b/>
-        </w:rPr>
-        <w:t xml:space="preserve">Item 2 (the platform) occupies a slot that could hold a peer-reviewed paper.</w:t>
-      </w:r>
-      <w:r>
-        <w:t xml:space="preserve"> </w:t>
-      </w:r>
-      <w:r>
-        <w:t xml:space="preserve">I think it</w:t>
-      </w:r>
-      <w:r>
-        <w:t xml:space="preserve"> </w:t>
-      </w:r>
-      <w:r>
-        <w:t xml:space="preserve">earns its place: it is the instrument the whole proposal rests on, it is unambiguously yours,</w:t>
-      </w:r>
-      <w:r>
-        <w:t xml:space="preserve"> </w:t>
-      </w:r>
-      <w:r>
-        <w:t xml:space="preserve">and it is the strongest available evidence that the project is feasible. But it is the entry a</w:t>
-      </w:r>
-      <w:r>
-        <w:t xml:space="preserve"> </w:t>
-      </w:r>
-      <w:r>
-        <w:t xml:space="preserve">conservative reviewer is most likely to discount, and a Zenodo DOI would substantially reduce</w:t>
-      </w:r>
-      <w:r>
-        <w:t xml:space="preserve"> </w:t>
-      </w:r>
-      <w:r>
-        <w:t xml:space="preserve">that risk.</w:t>
+        <w:t xml:space="preserve">rather than sampling the record evenly. A narrative CV rewards judgement about your own work,</w:t>
+      </w:r>
+      <w:r>
+        <w:t xml:space="preserve"> </w:t>
+      </w:r>
+      <w:r>
+        <w:t xml:space="preserve">and a list that showed everything would show no judgement at all.</w:t>
+      </w:r>
+    </w:p>
+    <w:p>
+      <w:pPr>
+        <w:pStyle w:val="FirstParagraph"/>
+      </w:pPr>
+      <w:r>
+        <w:rPr>
+          <w:bCs/>
+          <w:b/>
+        </w:rPr>
+        <w:t xml:space="preserve">Two decisions worth revisiting before you submit:</w:t>
       </w:r>
     </w:p>
     <w:p>
       <w:pPr>
         <w:numPr>
           <w:ilvl w:val="0"/>
-          <w:numId w:val="1001"/>
+          <w:numId w:val="1002"/>
         </w:numPr>
         <w:pStyle w:val="Compact"/>
       </w:pPr>
@@ -2800,7 +3221,53 @@
           <w:bCs/>
           <w:b/>
         </w:rPr>
-        <w:t xml:space="preserve">The Ng’ambi CVD paper (item 5) is accepted for publication</w:t>
+        <w:t xml:space="preserve">Item 2 (the platform) occupies a slot that could hold a peer-reviewed paper.</w:t>
+      </w:r>
+      <w:r>
+        <w:t xml:space="preserve"> </w:t>
+      </w:r>
+      <w:r>
+        <w:t xml:space="preserve">I think it</w:t>
+      </w:r>
+      <w:r>
+        <w:t xml:space="preserve"> </w:t>
+      </w:r>
+      <w:r>
+        <w:t xml:space="preserve">earns its place: it is the instrument the whole proposal rests on, it is unambiguously yours,</w:t>
+      </w:r>
+      <w:r>
+        <w:t xml:space="preserve"> </w:t>
+      </w:r>
+      <w:r>
+        <w:t xml:space="preserve">and it is the strongest available evidence that the project is feasible. But it is the entry a</w:t>
+      </w:r>
+      <w:r>
+        <w:t xml:space="preserve"> </w:t>
+      </w:r>
+      <w:r>
+        <w:t xml:space="preserve">conservative reviewer is most likely to discount, and a Zenodo DOI would substantially reduce</w:t>
+      </w:r>
+      <w:r>
+        <w:t xml:space="preserve"> </w:t>
+      </w:r>
+      <w:r>
+        <w:t xml:space="preserve">that risk.</w:t>
+      </w:r>
+    </w:p>
+    <w:p>
+      <w:pPr>
+        <w:numPr>
+          <w:ilvl w:val="0"/>
+          <w:numId w:val="1002"/>
+        </w:numPr>
+        <w:pStyle w:val="Compact"/>
+      </w:pPr>
+      <w:r>
+        <w:rPr>
+          <w:bCs/>
+          <w:b/>
+        </w:rPr>
+        <w:t xml:space="preserve">The Ng'ambi CVD paper (item 5) is accepted for publication</w:t>
       </w:r>
       <w:r>
         <w:t xml:space="preserve"> </w:t>
@@ -2821,11 +3288,9 @@
         <w:t xml:space="preserve">Update venue, year and DOI when they are assigned.</w:t>
       </w:r>
     </w:p>
-    <w:bookmarkEnd w:id="33"/>
-    <w:sectPr>
-      <w:pgSz w:h="16838" w:w="11906"/>
-      <w:pgMar w:top="1000" w:right="1134" w:bottom="900" w:left="1134" w:header="708" w:footer="708" w:gutter="0"/>
-    </w:sectPr>
+    <w:bookmarkEnd w:id="35"/>
+    <w:bookmarkEnd w:id="36"/>
+    <w:sectPr/>
   </w:body>
 </w:document>
 </file>
@@ -3013,6 +3478,9 @@
   <w:num w:numId="1001">
     <w:abstractNumId w:val="991"/>
   </w:num>
+  <w:num w:numId="1002">
+    <w:abstractNumId w:val="991"/>
+  </w:num>
 </w:numbering>
 </file>
 
@@ -3024,12 +3492,12 @@
         <w:rFonts w:asciiTheme="minorHAnsi" w:cstheme="minorBidi" w:eastAsiaTheme="minorHAnsi" w:hAnsiTheme="minorHAnsi"/>
         <w:sz w:val="24"/>
         <w:szCs w:val="24"/>
-        <w:lang w:bidi="ar-SA" w:eastAsia="en-US" w:val="fr"/>
+        <w:lang w:bidi="ar-SA" w:eastAsia="en-US" w:val="en-US"/>
       </w:rPr>
     </w:rPrDefault>
     <w:pPrDefault>
       <w:pPr>
-        <w:spacing w:after="60"/>
+        <w:spacing w:after="200"/>
       </w:pPr>
     </w:pPrDefault>
   </w:docDefaults>
@@ -3038,26 +3506,37 @@
     <w:name w:val="Normal"/>
     <w:qFormat/>
     <w:pPr>
-      <w:jc w:val="both"/>
+      <w:spacing w:after="20" w:before="0" w:line="360" w:lineRule="auto"/>
     </w:pPr>
+    <w:rPr>
+      <w:sz w:val="20"/>
+      <w:szCs w:val="20"/>
+    </w:rPr>
   </w:style>
   <w:style w:styleId="BodyText" w:type="paragraph">
     <w:name w:val="Body Text"/>
     <w:basedOn w:val="Normal"/>
     <w:link w:val="BodyTextChar"/>
     <w:pPr>
-      <w:spacing w:after="60" w:before="120"/>
-      <w:jc w:val="both"/>
+      <w:spacing w:after="20" w:before="0" w:line="360" w:lineRule="auto"/>
     </w:pPr>
     <w:qFormat/>
+    <w:rPr>
+      <w:sz w:val="20"/>
+      <w:szCs w:val="20"/>
+    </w:rPr>
   </w:style>
   <w:style w:customStyle="1" w:styleId="FirstParagraph" w:type="paragraph">
     <w:name w:val="First Paragraph"/>
     <w:basedOn w:val="BodyText"/>
     <w:next w:val="BodyText"/>
     <w:qFormat/>
+    <w:rPr>
+      <w:sz w:val="20"/>
+      <w:szCs w:val="20"/>
+    </w:rPr>
     <w:pPr>
-      <w:jc w:val="both"/>
+      <w:spacing w:after="20" w:before="0" w:line="360" w:lineRule="auto"/>
     </w:pPr>
   </w:style>
   <w:style w:customStyle="1" w:styleId="Compact" w:type="paragraph">
@@ -3065,9 +3544,12 @@
     <w:basedOn w:val="BodyText"/>
     <w:qFormat/>
     <w:pPr>
-      <w:spacing w:after="36" w:before="36"/>
-      <w:jc w:val="both"/>
+      <w:spacing w:after="20" w:before="0" w:line="360" w:lineRule="auto"/>
     </w:pPr>
+    <w:rPr>
+      <w:sz w:val="20"/>
+      <w:szCs w:val="20"/>
+    </w:rPr>
   </w:style>
   <w:style w:styleId="Title" w:type="paragraph">
     <w:name w:val="Title"/>
@@ -3077,7 +3559,7 @@
     <w:pPr>
       <w:keepNext/>
       <w:keepLines/>
-      <w:spacing w:after="60" w:before="120"/>
+      <w:spacing w:after="240" w:before="480"/>
       <w:jc w:val="center"/>
     </w:pPr>
     <w:rPr>
@@ -3097,7 +3579,7 @@
     <w:pPr>
       <w:keepNext/>
       <w:keepLines/>
-      <w:spacing w:after="60" w:before="120"/>
+      <w:spacing w:after="240" w:before="240"/>
       <w:jc w:val="center"/>
     </w:pPr>
     <w:rPr>
@@ -3134,7 +3616,7 @@
       <w:keepNext/>
       <w:keepLines/>
       <w:jc w:val="center"/>
-      <w:spacing w:after="0" w:before="120"/>
+      <w:spacing w:after="0" w:before="300"/>
     </w:pPr>
     <w:rPr>
       <w:sz w:val="20"/>
@@ -3152,7 +3634,7 @@
     <w:pPr>
       <w:keepNext/>
       <w:keepLines/>
-      <w:spacing w:after="60" w:before="100"/>
+      <w:spacing w:after="300" w:before="100"/>
     </w:pPr>
     <w:rPr>
       <w:sz w:val="20"/>
@@ -3176,7 +3658,7 @@
     <w:pPr>
       <w:keepNext/>
       <w:keepLines/>
-      <w:spacing w:after="0" w:before="120"/>
+      <w:spacing w:after="30" w:before="80" w:line="360" w:lineRule="auto"/>
       <w:outlineLvl w:val="0"/>
     </w:pPr>
     <w:rPr>
@@ -3184,8 +3666,8 @@
       <w:b/>
       <w:bCs/>
       <w:color w:themeColor="accent1" w:val="4F81BD"/>
-      <w:sz w:val="32"/>
-      <w:szCs w:val="32"/>
+      <w:sz w:val="24"/>
+      <w:szCs w:val="24"/>
     </w:rPr>
   </w:style>
   <w:style w:styleId="Heading2" w:type="paragraph">
@@ -3198,7 +3680,7 @@
     <w:pPr>
       <w:keepNext/>
       <w:keepLines/>
-      <w:spacing w:after="0" w:before="120"/>
+      <w:spacing w:after="40" w:before="100" w:line="360" w:lineRule="auto"/>
       <w:outlineLvl w:val="1"/>
     </w:pPr>
     <w:rPr>
@@ -3206,8 +3688,8 @@
       <w:b/>
       <w:bCs/>
       <w:color w:themeColor="accent1" w:val="4F81BD"/>
-      <w:sz w:val="28"/>
-      <w:szCs w:val="28"/>
+      <w:sz w:val="22"/>
+      <w:szCs w:val="22"/>
     </w:rPr>
   </w:style>
   <w:style w:styleId="Heading3" w:type="paragraph">
@@ -3220,7 +3702,7 @@
     <w:pPr>
       <w:keepNext/>
       <w:keepLines/>
-      <w:spacing w:after="0" w:before="120"/>
+      <w:spacing w:after="30" w:before="80" w:line="360" w:lineRule="auto"/>
       <w:outlineLvl w:val="2"/>
     </w:pPr>
     <w:rPr>
@@ -3228,8 +3710,8 @@
       <w:b/>
       <w:bCs/>
       <w:color w:themeColor="accent1" w:val="4F81BD"/>
-      <w:sz w:val="24"/>
-      <w:szCs w:val="24"/>
+      <w:sz w:val="20"/>
+      <w:szCs w:val="20"/>
     </w:rPr>
   </w:style>
   <w:style w:styleId="Heading4" w:type="paragraph">
@@ -3242,7 +3724,7 @@
     <w:pPr>
       <w:keepNext/>
       <w:keepLines/>
-      <w:spacing w:after="0" w:before="120"/>
+      <w:spacing w:after="30" w:before="80" w:line="360" w:lineRule="auto"/>
       <w:outlineLvl w:val="3"/>
     </w:pPr>
     <w:rPr>
@@ -3250,8 +3732,8 @@
       <w:i/>
       <w:bCs/>
       <w:color w:themeColor="accent1" w:val="4F81BD"/>
-      <w:sz w:val="24"/>
-      <w:szCs w:val="24"/>
+      <w:sz w:val="20"/>
+      <w:szCs w:val="20"/>
     </w:rPr>
   </w:style>
   <w:style w:styleId="Heading5" w:type="paragraph">
@@ -3264,15 +3746,15 @@
     <w:pPr>
       <w:keepNext/>
       <w:keepLines/>
-      <w:spacing w:after="0" w:before="120"/>
+      <w:spacing w:after="30" w:before="80" w:line="360" w:lineRule="auto"/>
       <w:outlineLvl w:val="4"/>
     </w:pPr>
     <w:rPr>
       <w:rFonts w:asciiTheme="majorHAnsi" w:cstheme="majorBidi" w:eastAsiaTheme="majorEastAsia" w:hAnsiTheme="majorHAnsi"/>
       <w:iCs/>
       <w:color w:themeColor="accent1" w:val="4F81BD"/>
-      <w:sz w:val="24"/>
-      <w:szCs w:val="24"/>
+      <w:sz w:val="20"/>
+      <w:szCs w:val="20"/>
     </w:rPr>
   </w:style>
   <w:style w:styleId="Heading6" w:type="paragraph">
@@ -3285,7 +3767,7 @@
     <w:pPr>
       <w:keepNext/>
       <w:keepLines/>
-      <w:spacing w:after="0" w:before="120"/>
+      <w:spacing w:after="0" w:before="200"/>
       <w:outlineLvl w:val="5"/>
     </w:pPr>
     <w:rPr>
@@ -3305,7 +3787,7 @@
     <w:pPr>
       <w:keepNext/>
       <w:keepLines/>
-      <w:spacing w:after="0" w:before="120"/>
+      <w:spacing w:after="0" w:before="200"/>
       <w:outlineLvl w:val="6"/>
     </w:pPr>
     <w:rPr>
@@ -3325,7 +3807,7 @@
     <w:pPr>
       <w:keepNext/>
       <w:keepLines/>
-      <w:spacing w:after="0" w:before="120"/>
+      <w:spacing w:after="0" w:before="200"/>
       <w:outlineLvl w:val="7"/>
     </w:pPr>
     <w:rPr>
@@ -3345,7 +3827,7 @@
     <w:pPr>
       <w:keepNext/>
       <w:keepLines/>
-      <w:spacing w:after="0" w:before="120"/>
+      <w:spacing w:after="0" w:before="200"/>
       <w:outlineLvl w:val="8"/>
     </w:pPr>
     <w:rPr>
@@ -3363,7 +3845,7 @@
     <w:unhideWhenUsed/>
     <w:qFormat/>
     <w:pPr>
-      <w:spacing w:after="60" w:before="100"/>
+      <w:spacing w:after="100" w:before="100"/>
       <w:ind w:firstLine="0" w:left="480" w:right="480"/>
     </w:pPr>
   </w:style>
@@ -3433,7 +3915,7 @@
     <w:basedOn w:val="Normal"/>
     <w:link w:val="BodyTextChar"/>
     <w:pPr>
-      <w:spacing w:after="60" w:before="0"/>
+      <w:spacing w:after="120" w:before="0"/>
     </w:pPr>
     <w:rPr>
       <w:i/>
@@ -3500,7 +3982,7 @@
     <w:unhideWhenUsed/>
     <w:qFormat/>
     <w:pPr>
-      <w:spacing w:before="120" w:line="259" w:lineRule="auto"/>
+      <w:spacing w:before="240" w:line="259" w:lineRule="auto"/>
       <w:outlineLvl w:val="9"/>
     </w:pPr>
     <w:rPr>

</xml_diff>